<commit_message>
Record subagent pilot and compliance improvements
</commit_message>
<xml_diff>
--- a/18_DOCX/AUTO_CASES_0037_0044.docx
+++ b/18_DOCX/AUTO_CASES_0037_0044.docx
@@ -7,12 +7,31 @@
         <w:pStyle w:val="Heading1"/>
       </w:pPr>
       <w:r>
-        <w:t>AUTO_CASES_0037_0044 - Nono e décimo lotes de estudos de caso AUTO</w:t>
-      </w:r>
-    </w:p>
-    <w:p>
-      <w:r>
-        <w:t>————————————————————————</w:t>
+        <w:t>AUTO_CASES_0037_0044</w:t>
+      </w:r>
+    </w:p>
+    <w:p>
+      <w:pPr>
+        <w:pStyle w:val="ListBullet"/>
+      </w:pPr>
+      <w:r>
+        <w:t>Versão: 0.2</w:t>
+      </w:r>
+    </w:p>
+    <w:p>
+      <w:pPr>
+        <w:pStyle w:val="ListBullet"/>
+      </w:pPr>
+      <w:r>
+        <w:t>Data: 2026-06-26</w:t>
+      </w:r>
+    </w:p>
+    <w:p>
+      <w:pPr>
+        <w:pStyle w:val="ListBullet"/>
+      </w:pPr>
+      <w:r>
+        <w:t>Autor: JP-BR Insurance Knowledge Base</w:t>
       </w:r>
     </w:p>
     <w:p>
@@ -391,24 +410,107 @@
         <w:t>Histórico de revisão</w:t>
       </w:r>
     </w:p>
-    <w:p>
-      <w:r>
-        <w:t>| Data | Versão | Autor | Alteração |</w:t>
-      </w:r>
-    </w:p>
-    <w:p>
-      <w:r>
-        <w:t>| --- | --- | --- | --- |</w:t>
-      </w:r>
-    </w:p>
-    <w:p>
-      <w:r>
-        <w:t>| 2026-06-25 | 0.1 | JP-BR Insurance Knowledge Base | Criação inicial. |</w:t>
-      </w:r>
-    </w:p>
-    <w:p>
-      <w:r>
-        <w:t>————————————————————————</w:t>
+    <w:tbl>
+      <w:tblPr>
+        <w:tblStyle w:val="TableGrid"/>
+        <w:tblW w:type="auto" w:w="0"/>
+        <w:tblLook w:firstColumn="1" w:firstRow="1" w:lastColumn="0" w:lastRow="0" w:noHBand="0" w:noVBand="1" w:val="04A0"/>
+      </w:tblPr>
+      <w:tblGrid>
+        <w:gridCol w:w="2448"/>
+        <w:gridCol w:w="2448"/>
+        <w:gridCol w:w="2448"/>
+        <w:gridCol w:w="2448"/>
+      </w:tblGrid>
+      <w:tr>
+        <w:tc>
+          <w:tcPr>
+            <w:tcW w:type="dxa" w:w="2448"/>
+          </w:tcPr>
+          <w:p>
+            <w:r>
+              <w:t>Data</w:t>
+            </w:r>
+          </w:p>
+        </w:tc>
+        <w:tc>
+          <w:tcPr>
+            <w:tcW w:type="dxa" w:w="2448"/>
+          </w:tcPr>
+          <w:p>
+            <w:r>
+              <w:t>Versão</w:t>
+            </w:r>
+          </w:p>
+        </w:tc>
+        <w:tc>
+          <w:tcPr>
+            <w:tcW w:type="dxa" w:w="2448"/>
+          </w:tcPr>
+          <w:p>
+            <w:r>
+              <w:t>Autor</w:t>
+            </w:r>
+          </w:p>
+        </w:tc>
+        <w:tc>
+          <w:tcPr>
+            <w:tcW w:type="dxa" w:w="2448"/>
+          </w:tcPr>
+          <w:p>
+            <w:r>
+              <w:t>Alteração</w:t>
+            </w:r>
+          </w:p>
+        </w:tc>
+      </w:tr>
+      <w:tr>
+        <w:tc>
+          <w:tcPr>
+            <w:tcW w:type="dxa" w:w="2448"/>
+          </w:tcPr>
+          <w:p>
+            <w:r>
+              <w:t>2026-06-25</w:t>
+            </w:r>
+          </w:p>
+        </w:tc>
+        <w:tc>
+          <w:tcPr>
+            <w:tcW w:type="dxa" w:w="2448"/>
+          </w:tcPr>
+          <w:p>
+            <w:r>
+              <w:t>0.1</w:t>
+            </w:r>
+          </w:p>
+        </w:tc>
+        <w:tc>
+          <w:tcPr>
+            <w:tcW w:type="dxa" w:w="2448"/>
+          </w:tcPr>
+          <w:p>
+            <w:r>
+              <w:t>JP-BR Insurance Knowledge Base</w:t>
+            </w:r>
+          </w:p>
+        </w:tc>
+        <w:tc>
+          <w:tcPr>
+            <w:tcW w:type="dxa" w:w="2448"/>
+          </w:tcPr>
+          <w:p>
+            <w:r>
+              <w:t>Criação inicial.</w:t>
+            </w:r>
+          </w:p>
+        </w:tc>
+      </w:tr>
+    </w:tbl>
+    <w:p/>
+    <w:p>
+      <w:r>
+        <w:t>---</w:t>
       </w:r>
     </w:p>
     <w:p>
@@ -547,6 +649,585 @@
     </w:p>
     <w:p>
       <w:r>
+        <w:t>Antes de contratar, vamos conferir juntos as informações importantes, o resumo do contrato e os alertas. Assim você entende o que está coberto, o que pode ficar fora e o que precisa atualizar depois.</w:t>
+      </w:r>
+    </w:p>
+    <w:p>
+      <w:pPr>
+        <w:pStyle w:val="Heading2"/>
+      </w:pPr>
+      <w:r>
+        <w:t>Próximo passo recomendado</w:t>
+      </w:r>
+    </w:p>
+    <w:p>
+      <w:r>
+        <w:t>Confirmar com o cliente: condutores reais, uso do veículo, dados do carro, coberturas escolhidas, franquia, exclusões principais e prazo de renovação.</w:t>
+      </w:r>
+    </w:p>
+    <w:p>
+      <w:pPr>
+        <w:pStyle w:val="Heading2"/>
+      </w:pPr>
+      <w:r>
+        <w:t>Limite comercial/compliance</w:t>
+      </w:r>
+    </w:p>
+    <w:p>
+      <w:r>
+        <w:t>O corretor deve explicar os pontos importantes e registrar a orientação, mas a cobertura efetiva depende das condições do contrato e da análise da seguradora em caso de sinistro.</w:t>
+      </w:r>
+    </w:p>
+    <w:p>
+      <w:pPr>
+        <w:pStyle w:val="Heading2"/>
+      </w:pPr>
+      <w:r>
+        <w:t>Resultado esperado</w:t>
+      </w:r>
+    </w:p>
+    <w:p>
+      <w:r>
+        <w:t>Cliente mantém contrato correto, entende o processo e recebe acompanhamento profissional depois da venda.</w:t>
+      </w:r>
+    </w:p>
+    <w:p>
+      <w:pPr>
+        <w:pStyle w:val="Heading2"/>
+      </w:pPr>
+      <w:r>
+        <w:t>Termos relacionados</w:t>
+      </w:r>
+    </w:p>
+    <w:p>
+      <w:pPr>
+        <w:pStyle w:val="ListBullet"/>
+      </w:pPr>
+      <w:r>
+        <w:t>AUTO-0084 - 重要事項説明 - Explicação de informações importantes</w:t>
+      </w:r>
+    </w:p>
+    <w:p>
+      <w:pPr>
+        <w:pStyle w:val="ListBullet"/>
+      </w:pPr>
+      <w:r>
+        <w:t>AUTO-0085 - 契約概要 - Resumo do contrato</w:t>
+      </w:r>
+    </w:p>
+    <w:p>
+      <w:pPr>
+        <w:pStyle w:val="ListBullet"/>
+      </w:pPr>
+      <w:r>
+        <w:t>AUTO-0086 - 注意喚起情報 - Informações de alerta</w:t>
+      </w:r>
+    </w:p>
+    <w:p>
+      <w:pPr>
+        <w:pStyle w:val="ListBullet"/>
+      </w:pPr>
+      <w:r>
+        <w:t>AUTO-0087 - 契約確認 - Confirmação do contrato</w:t>
+      </w:r>
+    </w:p>
+    <w:p>
+      <w:pPr>
+        <w:pStyle w:val="Heading2"/>
+      </w:pPr>
+      <w:r>
+        <w:t>FAQs relacionadas</w:t>
+      </w:r>
+    </w:p>
+    <w:p>
+      <w:pPr>
+        <w:pStyle w:val="ListBullet"/>
+      </w:pPr>
+      <w:r>
+        <w:t>FAQ-AUTO-0081</w:t>
+      </w:r>
+    </w:p>
+    <w:p>
+      <w:pPr>
+        <w:pStyle w:val="ListBullet"/>
+      </w:pPr>
+      <w:r>
+        <w:t>FAQ-AUTO-0082</w:t>
+      </w:r>
+    </w:p>
+    <w:p>
+      <w:pPr>
+        <w:pStyle w:val="ListBullet"/>
+      </w:pPr>
+      <w:r>
+        <w:t>FAQ-AUTO-0083</w:t>
+      </w:r>
+    </w:p>
+    <w:p>
+      <w:pPr>
+        <w:pStyle w:val="ListBullet"/>
+      </w:pPr>
+      <w:r>
+        <w:t>FAQ-AUTO-0084</w:t>
+      </w:r>
+    </w:p>
+    <w:p>
+      <w:pPr>
+        <w:pStyle w:val="Heading2"/>
+      </w:pPr>
+      <w:r>
+        <w:t>Diálogos relacionados</w:t>
+      </w:r>
+    </w:p>
+    <w:p>
+      <w:pPr>
+        <w:pStyle w:val="ListBullet"/>
+      </w:pPr>
+      <w:r>
+        <w:t>DIALOGUE-AUTO-0028</w:t>
+      </w:r>
+    </w:p>
+    <w:p>
+      <w:pPr>
+        <w:pStyle w:val="Heading2"/>
+      </w:pPr>
+      <w:r>
+        <w:t>Referências cruzadas</w:t>
+      </w:r>
+    </w:p>
+    <w:p>
+      <w:pPr>
+        <w:pStyle w:val="ListBullet"/>
+      </w:pPr>
+      <w:r>
+        <w:t>AUTO-0084</w:t>
+      </w:r>
+    </w:p>
+    <w:p>
+      <w:pPr>
+        <w:pStyle w:val="ListBullet"/>
+      </w:pPr>
+      <w:r>
+        <w:t>AUTO-0085</w:t>
+      </w:r>
+    </w:p>
+    <w:p>
+      <w:pPr>
+        <w:pStyle w:val="ListBullet"/>
+      </w:pPr>
+      <w:r>
+        <w:t>AUTO-0086</w:t>
+      </w:r>
+    </w:p>
+    <w:p>
+      <w:pPr>
+        <w:pStyle w:val="ListBullet"/>
+      </w:pPr>
+      <w:r>
+        <w:t>AUTO-0087</w:t>
+      </w:r>
+    </w:p>
+    <w:p>
+      <w:pPr>
+        <w:pStyle w:val="ListBullet"/>
+      </w:pPr>
+      <w:r>
+        <w:t>FAQ-AUTO-0081</w:t>
+      </w:r>
+    </w:p>
+    <w:p>
+      <w:pPr>
+        <w:pStyle w:val="ListBullet"/>
+      </w:pPr>
+      <w:r>
+        <w:t>FAQ-AUTO-0082</w:t>
+      </w:r>
+    </w:p>
+    <w:p>
+      <w:pPr>
+        <w:pStyle w:val="ListBullet"/>
+      </w:pPr>
+      <w:r>
+        <w:t>FAQ-AUTO-0083</w:t>
+      </w:r>
+    </w:p>
+    <w:p>
+      <w:pPr>
+        <w:pStyle w:val="ListBullet"/>
+      </w:pPr>
+      <w:r>
+        <w:t>FAQ-AUTO-0084</w:t>
+      </w:r>
+    </w:p>
+    <w:p>
+      <w:pPr>
+        <w:pStyle w:val="ListBullet"/>
+      </w:pPr>
+      <w:r>
+        <w:t>DIALOGUE-AUTO-0028</w:t>
+      </w:r>
+    </w:p>
+    <w:p>
+      <w:pPr>
+        <w:pStyle w:val="Heading2"/>
+      </w:pPr>
+      <w:r>
+        <w:t>Referências</w:t>
+      </w:r>
+    </w:p>
+    <w:p>
+      <w:pPr>
+        <w:pStyle w:val="ListBullet"/>
+      </w:pPr>
+      <w:r>
+        <w:t>Documento interno: `EDITORIAL_RULES.md`</w:t>
+      </w:r>
+    </w:p>
+    <w:p>
+      <w:pPr>
+        <w:pStyle w:val="Heading2"/>
+      </w:pPr>
+      <w:r>
+        <w:t>Tags</w:t>
+      </w:r>
+    </w:p>
+    <w:p>
+      <w:pPr>
+        <w:pStyle w:val="ListBullet"/>
+      </w:pPr>
+      <w:r>
+        <w:t>case</w:t>
+      </w:r>
+    </w:p>
+    <w:p>
+      <w:pPr>
+        <w:pStyle w:val="ListBullet"/>
+      </w:pPr>
+      <w:r>
+        <w:t>auto</w:t>
+      </w:r>
+    </w:p>
+    <w:p>
+      <w:pPr>
+        <w:pStyle w:val="ListBullet"/>
+      </w:pPr>
+      <w:r>
+        <w:t>atendimento</w:t>
+      </w:r>
+    </w:p>
+    <w:p>
+      <w:pPr>
+        <w:pStyle w:val="ListBullet"/>
+      </w:pPr>
+      <w:r>
+        <w:t>revisao</w:t>
+      </w:r>
+    </w:p>
+    <w:p>
+      <w:pPr>
+        <w:pStyle w:val="Heading2"/>
+      </w:pPr>
+      <w:r>
+        <w:t>Veja também</w:t>
+      </w:r>
+    </w:p>
+    <w:p>
+      <w:pPr>
+        <w:pStyle w:val="ListBullet"/>
+      </w:pPr>
+      <w:r>
+        <w:t>`14_FAQ/AUTO/FAQ-AUTO-0081.md`</w:t>
+      </w:r>
+    </w:p>
+    <w:p>
+      <w:pPr>
+        <w:pStyle w:val="Heading2"/>
+      </w:pPr>
+      <w:r>
+        <w:t>Histórico de revisão</w:t>
+      </w:r>
+    </w:p>
+    <w:tbl>
+      <w:tblPr>
+        <w:tblStyle w:val="TableGrid"/>
+        <w:tblW w:type="auto" w:w="0"/>
+        <w:tblLook w:firstColumn="1" w:firstRow="1" w:lastColumn="0" w:lastRow="0" w:noHBand="0" w:noVBand="1" w:val="04A0"/>
+      </w:tblPr>
+      <w:tblGrid>
+        <w:gridCol w:w="2448"/>
+        <w:gridCol w:w="2448"/>
+        <w:gridCol w:w="2448"/>
+        <w:gridCol w:w="2448"/>
+      </w:tblGrid>
+      <w:tr>
+        <w:tc>
+          <w:tcPr>
+            <w:tcW w:type="dxa" w:w="2448"/>
+          </w:tcPr>
+          <w:p>
+            <w:r>
+              <w:t>Data</w:t>
+            </w:r>
+          </w:p>
+        </w:tc>
+        <w:tc>
+          <w:tcPr>
+            <w:tcW w:type="dxa" w:w="2448"/>
+          </w:tcPr>
+          <w:p>
+            <w:r>
+              <w:t>Versão</w:t>
+            </w:r>
+          </w:p>
+        </w:tc>
+        <w:tc>
+          <w:tcPr>
+            <w:tcW w:type="dxa" w:w="2448"/>
+          </w:tcPr>
+          <w:p>
+            <w:r>
+              <w:t>Autor</w:t>
+            </w:r>
+          </w:p>
+        </w:tc>
+        <w:tc>
+          <w:tcPr>
+            <w:tcW w:type="dxa" w:w="2448"/>
+          </w:tcPr>
+          <w:p>
+            <w:r>
+              <w:t>Alteração</w:t>
+            </w:r>
+          </w:p>
+        </w:tc>
+      </w:tr>
+      <w:tr>
+        <w:tc>
+          <w:tcPr>
+            <w:tcW w:type="dxa" w:w="2448"/>
+          </w:tcPr>
+          <w:p>
+            <w:r>
+              <w:t>2026-06-25</w:t>
+            </w:r>
+          </w:p>
+        </w:tc>
+        <w:tc>
+          <w:tcPr>
+            <w:tcW w:type="dxa" w:w="2448"/>
+          </w:tcPr>
+          <w:p>
+            <w:r>
+              <w:t>0.1</w:t>
+            </w:r>
+          </w:p>
+        </w:tc>
+        <w:tc>
+          <w:tcPr>
+            <w:tcW w:type="dxa" w:w="2448"/>
+          </w:tcPr>
+          <w:p>
+            <w:r>
+              <w:t>JP-BR Insurance Knowledge Base</w:t>
+            </w:r>
+          </w:p>
+        </w:tc>
+        <w:tc>
+          <w:tcPr>
+            <w:tcW w:type="dxa" w:w="2448"/>
+          </w:tcPr>
+          <w:p>
+            <w:r>
+              <w:t>Criação inicial.</w:t>
+            </w:r>
+          </w:p>
+        </w:tc>
+      </w:tr>
+      <w:tr>
+        <w:tc>
+          <w:tcPr>
+            <w:tcW w:type="dxa" w:w="2448"/>
+          </w:tcPr>
+          <w:p>
+            <w:r>
+              <w:t>2026-06-26</w:t>
+            </w:r>
+          </w:p>
+        </w:tc>
+        <w:tc>
+          <w:tcPr>
+            <w:tcW w:type="dxa" w:w="2448"/>
+          </w:tcPr>
+          <w:p>
+            <w:r>
+              <w:t>0.2</w:t>
+            </w:r>
+          </w:p>
+        </w:tc>
+        <w:tc>
+          <w:tcPr>
+            <w:tcW w:type="dxa" w:w="2448"/>
+          </w:tcPr>
+          <w:p>
+            <w:r>
+              <w:t>JP-BR Insurance Knowledge Base</w:t>
+            </w:r>
+          </w:p>
+        </w:tc>
+        <w:tc>
+          <w:tcPr>
+            <w:tcW w:type="dxa" w:w="2448"/>
+          </w:tcPr>
+          <w:p>
+            <w:r>
+              <w:t>Reforço de explicação prática, próximo passo e limite comercial.</w:t>
+            </w:r>
+          </w:p>
+        </w:tc>
+      </w:tr>
+    </w:tbl>
+    <w:p/>
+    <w:p>
+      <w:r>
+        <w:t>---</w:t>
+      </w:r>
+    </w:p>
+    <w:p>
+      <w:pPr>
+        <w:pStyle w:val="Heading1"/>
+      </w:pPr>
+      <w:r>
+        <w:t>CASE-AUTO-0039 - Dados do cliente, veículo ou condutor estão incorretos</w:t>
+      </w:r>
+    </w:p>
+    <w:p>
+      <w:pPr>
+        <w:pStyle w:val="Heading2"/>
+      </w:pPr>
+      <w:r>
+        <w:t>Controle</w:t>
+      </w:r>
+    </w:p>
+    <w:p>
+      <w:pPr>
+        <w:pStyle w:val="ListBullet"/>
+      </w:pPr>
+      <w:r>
+        <w:t>Versão: 0.1</w:t>
+      </w:r>
+    </w:p>
+    <w:p>
+      <w:pPr>
+        <w:pStyle w:val="ListBullet"/>
+      </w:pPr>
+      <w:r>
+        <w:t>Data: 2026-06-25</w:t>
+      </w:r>
+    </w:p>
+    <w:p>
+      <w:pPr>
+        <w:pStyle w:val="ListBullet"/>
+      </w:pPr>
+      <w:r>
+        <w:t>Autor: JP-BR Insurance Knowledge Base</w:t>
+      </w:r>
+    </w:p>
+    <w:p>
+      <w:pPr>
+        <w:pStyle w:val="ListBullet"/>
+      </w:pPr>
+      <w:r>
+        <w:t>Histórico: Criação inicial.</w:t>
+      </w:r>
+    </w:p>
+    <w:p>
+      <w:pPr>
+        <w:pStyle w:val="Heading2"/>
+      </w:pPr>
+      <w:r>
+        <w:t>Código</w:t>
+      </w:r>
+    </w:p>
+    <w:p>
+      <w:r>
+        <w:t>CASE-AUTO-0039</w:t>
+      </w:r>
+    </w:p>
+    <w:p>
+      <w:pPr>
+        <w:pStyle w:val="Heading2"/>
+      </w:pPr>
+      <w:r>
+        <w:t>Produto ou categoria</w:t>
+      </w:r>
+    </w:p>
+    <w:p>
+      <w:r>
+        <w:t>AUTO</w:t>
+      </w:r>
+    </w:p>
+    <w:p>
+      <w:pPr>
+        <w:pStyle w:val="Heading2"/>
+      </w:pPr>
+      <w:r>
+        <w:t>Situação</w:t>
+      </w:r>
+    </w:p>
+    <w:p>
+      <w:r>
+        <w:t>Dados do cliente, veículo ou condutor estão incorretos.</w:t>
+      </w:r>
+    </w:p>
+    <w:p>
+      <w:pPr>
+        <w:pStyle w:val="Heading2"/>
+      </w:pPr>
+      <w:r>
+        <w:t>Problema</w:t>
+      </w:r>
+    </w:p>
+    <w:p>
+      <w:r>
+        <w:t>Cliente pode manter contrato desatualizado, interpretar resumo como contrato completo ou perder prazo importante por falta de acompanhamento.</w:t>
+      </w:r>
+    </w:p>
+    <w:p>
+      <w:pPr>
+        <w:pStyle w:val="Heading2"/>
+      </w:pPr>
+      <w:r>
+        <w:t>Análise</w:t>
+      </w:r>
+    </w:p>
+    <w:p>
+      <w:r>
+        <w:t>Atendimento recorrente, conferência de dados, revisão de cobertura e controle de vencimento reduzem riscos comerciais e operacionais.</w:t>
+      </w:r>
+    </w:p>
+    <w:p>
+      <w:pPr>
+        <w:pStyle w:val="Heading2"/>
+      </w:pPr>
+      <w:r>
+        <w:t>Orientação ao corretor</w:t>
+      </w:r>
+    </w:p>
+    <w:p>
+      <w:r>
+        <w:t>Revisar dados e coberturas com método, registrar mudanças e orientar o cliente antes de vencimento, cancelamento ou sinistro.</w:t>
+      </w:r>
+    </w:p>
+    <w:p>
+      <w:pPr>
+        <w:pStyle w:val="Heading2"/>
+      </w:pPr>
+      <w:r>
+        <w:t>Como explicar ao cliente brasileiro</w:t>
+      </w:r>
+    </w:p>
+    <w:p>
+      <w:r>
         <w:t>Vamos manter seu seguro atualizado para evitar surpresa quando você precisar usar ou renovar.</w:t>
       </w:r>
     </w:p>
@@ -576,7 +1257,7 @@
         <w:pStyle w:val="ListBullet"/>
       </w:pPr>
       <w:r>
-        <w:t>AUTO-0084 - 重要事項説明 - Explicação de informações importantes</w:t>
+        <w:t>AUTO-0088 - 顧客情報 - Informações do cliente</w:t>
       </w:r>
     </w:p>
     <w:p>
@@ -584,7 +1265,7 @@
         <w:pStyle w:val="ListBullet"/>
       </w:pPr>
       <w:r>
-        <w:t>AUTO-0085 - 契約概要 - Resumo do contrato</w:t>
+        <w:t>AUTO-0089 - 車両情報 - Informações do veículo</w:t>
       </w:r>
     </w:p>
     <w:p>
@@ -592,7 +1273,15 @@
         <w:pStyle w:val="ListBullet"/>
       </w:pPr>
       <w:r>
-        <w:t>AUTO-0086 - 注意喚起情報 - Informações de alerta</w:t>
+        <w:t>AUTO-0090 - 運転者情報 - Informações do condutor</w:t>
+      </w:r>
+    </w:p>
+    <w:p>
+      <w:pPr>
+        <w:pStyle w:val="Heading2"/>
+      </w:pPr>
+      <w:r>
+        <w:t>FAQs relacionadas</w:t>
       </w:r>
     </w:p>
     <w:p>
@@ -600,7 +1289,23 @@
         <w:pStyle w:val="ListBullet"/>
       </w:pPr>
       <w:r>
-        <w:t>AUTO-0087 - 契約確認 - Confirmação do contrato</w:t>
+        <w:t>FAQ-AUTO-0085</w:t>
+      </w:r>
+    </w:p>
+    <w:p>
+      <w:pPr>
+        <w:pStyle w:val="ListBullet"/>
+      </w:pPr>
+      <w:r>
+        <w:t>FAQ-AUTO-0086</w:t>
+      </w:r>
+    </w:p>
+    <w:p>
+      <w:pPr>
+        <w:pStyle w:val="ListBullet"/>
+      </w:pPr>
+      <w:r>
+        <w:t>FAQ-AUTO-0087</w:t>
       </w:r>
     </w:p>
     <w:p>
@@ -608,6 +1313,445 @@
         <w:pStyle w:val="Heading2"/>
       </w:pPr>
       <w:r>
+        <w:t>Diálogos relacionados</w:t>
+      </w:r>
+    </w:p>
+    <w:p>
+      <w:pPr>
+        <w:pStyle w:val="ListBullet"/>
+      </w:pPr>
+      <w:r>
+        <w:t>DIALOGUE-AUTO-0029</w:t>
+      </w:r>
+    </w:p>
+    <w:p>
+      <w:pPr>
+        <w:pStyle w:val="Heading2"/>
+      </w:pPr>
+      <w:r>
+        <w:t>Referências cruzadas</w:t>
+      </w:r>
+    </w:p>
+    <w:p>
+      <w:pPr>
+        <w:pStyle w:val="ListBullet"/>
+      </w:pPr>
+      <w:r>
+        <w:t>AUTO-0088</w:t>
+      </w:r>
+    </w:p>
+    <w:p>
+      <w:pPr>
+        <w:pStyle w:val="ListBullet"/>
+      </w:pPr>
+      <w:r>
+        <w:t>AUTO-0089</w:t>
+      </w:r>
+    </w:p>
+    <w:p>
+      <w:pPr>
+        <w:pStyle w:val="ListBullet"/>
+      </w:pPr>
+      <w:r>
+        <w:t>AUTO-0090</w:t>
+      </w:r>
+    </w:p>
+    <w:p>
+      <w:pPr>
+        <w:pStyle w:val="ListBullet"/>
+      </w:pPr>
+      <w:r>
+        <w:t>FAQ-AUTO-0085</w:t>
+      </w:r>
+    </w:p>
+    <w:p>
+      <w:pPr>
+        <w:pStyle w:val="ListBullet"/>
+      </w:pPr>
+      <w:r>
+        <w:t>FAQ-AUTO-0086</w:t>
+      </w:r>
+    </w:p>
+    <w:p>
+      <w:pPr>
+        <w:pStyle w:val="ListBullet"/>
+      </w:pPr>
+      <w:r>
+        <w:t>FAQ-AUTO-0087</w:t>
+      </w:r>
+    </w:p>
+    <w:p>
+      <w:pPr>
+        <w:pStyle w:val="ListBullet"/>
+      </w:pPr>
+      <w:r>
+        <w:t>DIALOGUE-AUTO-0029</w:t>
+      </w:r>
+    </w:p>
+    <w:p>
+      <w:pPr>
+        <w:pStyle w:val="Heading2"/>
+      </w:pPr>
+      <w:r>
+        <w:t>Referências</w:t>
+      </w:r>
+    </w:p>
+    <w:p>
+      <w:pPr>
+        <w:pStyle w:val="ListBullet"/>
+      </w:pPr>
+      <w:r>
+        <w:t>Documento interno: `EDITORIAL_RULES.md`</w:t>
+      </w:r>
+    </w:p>
+    <w:p>
+      <w:pPr>
+        <w:pStyle w:val="Heading2"/>
+      </w:pPr>
+      <w:r>
+        <w:t>Tags</w:t>
+      </w:r>
+    </w:p>
+    <w:p>
+      <w:pPr>
+        <w:pStyle w:val="ListBullet"/>
+      </w:pPr>
+      <w:r>
+        <w:t>case</w:t>
+      </w:r>
+    </w:p>
+    <w:p>
+      <w:pPr>
+        <w:pStyle w:val="ListBullet"/>
+      </w:pPr>
+      <w:r>
+        <w:t>auto</w:t>
+      </w:r>
+    </w:p>
+    <w:p>
+      <w:pPr>
+        <w:pStyle w:val="ListBullet"/>
+      </w:pPr>
+      <w:r>
+        <w:t>atendimento</w:t>
+      </w:r>
+    </w:p>
+    <w:p>
+      <w:pPr>
+        <w:pStyle w:val="ListBullet"/>
+      </w:pPr>
+      <w:r>
+        <w:t>revisao</w:t>
+      </w:r>
+    </w:p>
+    <w:p>
+      <w:pPr>
+        <w:pStyle w:val="Heading2"/>
+      </w:pPr>
+      <w:r>
+        <w:t>Veja também</w:t>
+      </w:r>
+    </w:p>
+    <w:p>
+      <w:pPr>
+        <w:pStyle w:val="ListBullet"/>
+      </w:pPr>
+      <w:r>
+        <w:t>`14_FAQ/AUTO/FAQ-AUTO-0085.md`</w:t>
+      </w:r>
+    </w:p>
+    <w:p>
+      <w:pPr>
+        <w:pStyle w:val="Heading2"/>
+      </w:pPr>
+      <w:r>
+        <w:t>Histórico de revisão</w:t>
+      </w:r>
+    </w:p>
+    <w:tbl>
+      <w:tblPr>
+        <w:tblStyle w:val="TableGrid"/>
+        <w:tblW w:type="auto" w:w="0"/>
+        <w:tblLook w:firstColumn="1" w:firstRow="1" w:lastColumn="0" w:lastRow="0" w:noHBand="0" w:noVBand="1" w:val="04A0"/>
+      </w:tblPr>
+      <w:tblGrid>
+        <w:gridCol w:w="2448"/>
+        <w:gridCol w:w="2448"/>
+        <w:gridCol w:w="2448"/>
+        <w:gridCol w:w="2448"/>
+      </w:tblGrid>
+      <w:tr>
+        <w:tc>
+          <w:tcPr>
+            <w:tcW w:type="dxa" w:w="2448"/>
+          </w:tcPr>
+          <w:p>
+            <w:r>
+              <w:t>Data</w:t>
+            </w:r>
+          </w:p>
+        </w:tc>
+        <w:tc>
+          <w:tcPr>
+            <w:tcW w:type="dxa" w:w="2448"/>
+          </w:tcPr>
+          <w:p>
+            <w:r>
+              <w:t>Versão</w:t>
+            </w:r>
+          </w:p>
+        </w:tc>
+        <w:tc>
+          <w:tcPr>
+            <w:tcW w:type="dxa" w:w="2448"/>
+          </w:tcPr>
+          <w:p>
+            <w:r>
+              <w:t>Autor</w:t>
+            </w:r>
+          </w:p>
+        </w:tc>
+        <w:tc>
+          <w:tcPr>
+            <w:tcW w:type="dxa" w:w="2448"/>
+          </w:tcPr>
+          <w:p>
+            <w:r>
+              <w:t>Alteração</w:t>
+            </w:r>
+          </w:p>
+        </w:tc>
+      </w:tr>
+      <w:tr>
+        <w:tc>
+          <w:tcPr>
+            <w:tcW w:type="dxa" w:w="2448"/>
+          </w:tcPr>
+          <w:p>
+            <w:r>
+              <w:t>2026-06-25</w:t>
+            </w:r>
+          </w:p>
+        </w:tc>
+        <w:tc>
+          <w:tcPr>
+            <w:tcW w:type="dxa" w:w="2448"/>
+          </w:tcPr>
+          <w:p>
+            <w:r>
+              <w:t>0.1</w:t>
+            </w:r>
+          </w:p>
+        </w:tc>
+        <w:tc>
+          <w:tcPr>
+            <w:tcW w:type="dxa" w:w="2448"/>
+          </w:tcPr>
+          <w:p>
+            <w:r>
+              <w:t>JP-BR Insurance Knowledge Base</w:t>
+            </w:r>
+          </w:p>
+        </w:tc>
+        <w:tc>
+          <w:tcPr>
+            <w:tcW w:type="dxa" w:w="2448"/>
+          </w:tcPr>
+          <w:p>
+            <w:r>
+              <w:t>Criação inicial.</w:t>
+            </w:r>
+          </w:p>
+        </w:tc>
+      </w:tr>
+    </w:tbl>
+    <w:p/>
+    <w:p>
+      <w:r>
+        <w:t>---</w:t>
+      </w:r>
+    </w:p>
+    <w:p>
+      <w:pPr>
+        <w:pStyle w:val="Heading1"/>
+      </w:pPr>
+      <w:r>
+        <w:t>CASE-AUTO-0040 - Cliente não sabe o fluxo correto após acidente</w:t>
+      </w:r>
+    </w:p>
+    <w:p>
+      <w:pPr>
+        <w:pStyle w:val="Heading2"/>
+      </w:pPr>
+      <w:r>
+        <w:t>Controle</w:t>
+      </w:r>
+    </w:p>
+    <w:p>
+      <w:pPr>
+        <w:pStyle w:val="ListBullet"/>
+      </w:pPr>
+      <w:r>
+        <w:t>Versão: 0.1</w:t>
+      </w:r>
+    </w:p>
+    <w:p>
+      <w:pPr>
+        <w:pStyle w:val="ListBullet"/>
+      </w:pPr>
+      <w:r>
+        <w:t>Data: 2026-06-25</w:t>
+      </w:r>
+    </w:p>
+    <w:p>
+      <w:pPr>
+        <w:pStyle w:val="ListBullet"/>
+      </w:pPr>
+      <w:r>
+        <w:t>Autor: JP-BR Insurance Knowledge Base</w:t>
+      </w:r>
+    </w:p>
+    <w:p>
+      <w:pPr>
+        <w:pStyle w:val="ListBullet"/>
+      </w:pPr>
+      <w:r>
+        <w:t>Histórico: Criação inicial.</w:t>
+      </w:r>
+    </w:p>
+    <w:p>
+      <w:pPr>
+        <w:pStyle w:val="Heading2"/>
+      </w:pPr>
+      <w:r>
+        <w:t>Código</w:t>
+      </w:r>
+    </w:p>
+    <w:p>
+      <w:r>
+        <w:t>CASE-AUTO-0040</w:t>
+      </w:r>
+    </w:p>
+    <w:p>
+      <w:pPr>
+        <w:pStyle w:val="Heading2"/>
+      </w:pPr>
+      <w:r>
+        <w:t>Produto ou categoria</w:t>
+      </w:r>
+    </w:p>
+    <w:p>
+      <w:r>
+        <w:t>AUTO</w:t>
+      </w:r>
+    </w:p>
+    <w:p>
+      <w:pPr>
+        <w:pStyle w:val="Heading2"/>
+      </w:pPr>
+      <w:r>
+        <w:t>Situação</w:t>
+      </w:r>
+    </w:p>
+    <w:p>
+      <w:r>
+        <w:t>Cliente não sabe o fluxo correto após acidente.</w:t>
+      </w:r>
+    </w:p>
+    <w:p>
+      <w:pPr>
+        <w:pStyle w:val="Heading2"/>
+      </w:pPr>
+      <w:r>
+        <w:t>Problema</w:t>
+      </w:r>
+    </w:p>
+    <w:p>
+      <w:r>
+        <w:t>Cliente pode manter contrato desatualizado, interpretar resumo como contrato completo ou perder prazo importante por falta de acompanhamento.</w:t>
+      </w:r>
+    </w:p>
+    <w:p>
+      <w:pPr>
+        <w:pStyle w:val="Heading2"/>
+      </w:pPr>
+      <w:r>
+        <w:t>Análise</w:t>
+      </w:r>
+    </w:p>
+    <w:p>
+      <w:r>
+        <w:t>Atendimento recorrente, conferência de dados, revisão de cobertura e controle de vencimento reduzem riscos comerciais e operacionais.</w:t>
+      </w:r>
+    </w:p>
+    <w:p>
+      <w:pPr>
+        <w:pStyle w:val="Heading2"/>
+      </w:pPr>
+      <w:r>
+        <w:t>Orientação ao corretor</w:t>
+      </w:r>
+    </w:p>
+    <w:p>
+      <w:r>
+        <w:t>Revisar dados e coberturas com método, registrar mudanças e orientar o cliente antes de vencimento, cancelamento ou sinistro.</w:t>
+      </w:r>
+    </w:p>
+    <w:p>
+      <w:pPr>
+        <w:pStyle w:val="Heading2"/>
+      </w:pPr>
+      <w:r>
+        <w:t>Como explicar ao cliente brasileiro</w:t>
+      </w:r>
+    </w:p>
+    <w:p>
+      <w:r>
+        <w:t>Vamos manter seu seguro atualizado para evitar surpresa quando você precisar usar ou renovar.</w:t>
+      </w:r>
+    </w:p>
+    <w:p>
+      <w:pPr>
+        <w:pStyle w:val="Heading2"/>
+      </w:pPr>
+      <w:r>
+        <w:t>Resultado esperado</w:t>
+      </w:r>
+    </w:p>
+    <w:p>
+      <w:r>
+        <w:t>Cliente mantém contrato correto, entende o processo e recebe acompanhamento profissional depois da venda.</w:t>
+      </w:r>
+    </w:p>
+    <w:p>
+      <w:pPr>
+        <w:pStyle w:val="Heading2"/>
+      </w:pPr>
+      <w:r>
+        <w:t>Termos relacionados</w:t>
+      </w:r>
+    </w:p>
+    <w:p>
+      <w:pPr>
+        <w:pStyle w:val="ListBullet"/>
+      </w:pPr>
+      <w:r>
+        <w:t>AUTO-0091 - 事故対応フロー - Fluxo de atendimento em acidente</w:t>
+      </w:r>
+    </w:p>
+    <w:p>
+      <w:pPr>
+        <w:pStyle w:val="ListBullet"/>
+      </w:pPr>
+      <w:r>
+        <w:t>AUTO-0092 - 必要書類 - Documentos necessários</w:t>
+      </w:r>
+    </w:p>
+    <w:p>
+      <w:pPr>
+        <w:pStyle w:val="Heading2"/>
+      </w:pPr>
+      <w:r>
         <w:t>FAQs relacionadas</w:t>
       </w:r>
     </w:p>
@@ -616,7 +1760,7 @@
         <w:pStyle w:val="ListBullet"/>
       </w:pPr>
       <w:r>
-        <w:t>FAQ-AUTO-0081</w:t>
+        <w:t>FAQ-AUTO-0088</w:t>
       </w:r>
     </w:p>
     <w:p>
@@ -624,7 +1768,15 @@
         <w:pStyle w:val="ListBullet"/>
       </w:pPr>
       <w:r>
-        <w:t>FAQ-AUTO-0082</w:t>
+        <w:t>FAQ-AUTO-0089</w:t>
+      </w:r>
+    </w:p>
+    <w:p>
+      <w:pPr>
+        <w:pStyle w:val="Heading2"/>
+      </w:pPr>
+      <w:r>
+        <w:t>Diálogos relacionados</w:t>
       </w:r>
     </w:p>
     <w:p>
@@ -632,7 +1784,15 @@
         <w:pStyle w:val="ListBullet"/>
       </w:pPr>
       <w:r>
-        <w:t>FAQ-AUTO-0083</w:t>
+        <w:t>DIALOGUE-AUTO-0030</w:t>
+      </w:r>
+    </w:p>
+    <w:p>
+      <w:pPr>
+        <w:pStyle w:val="Heading2"/>
+      </w:pPr>
+      <w:r>
+        <w:t>Referências cruzadas</w:t>
       </w:r>
     </w:p>
     <w:p>
@@ -640,7 +1800,39 @@
         <w:pStyle w:val="ListBullet"/>
       </w:pPr>
       <w:r>
-        <w:t>FAQ-AUTO-0084</w:t>
+        <w:t>AUTO-0091</w:t>
+      </w:r>
+    </w:p>
+    <w:p>
+      <w:pPr>
+        <w:pStyle w:val="ListBullet"/>
+      </w:pPr>
+      <w:r>
+        <w:t>AUTO-0092</w:t>
+      </w:r>
+    </w:p>
+    <w:p>
+      <w:pPr>
+        <w:pStyle w:val="ListBullet"/>
+      </w:pPr>
+      <w:r>
+        <w:t>FAQ-AUTO-0088</w:t>
+      </w:r>
+    </w:p>
+    <w:p>
+      <w:pPr>
+        <w:pStyle w:val="ListBullet"/>
+      </w:pPr>
+      <w:r>
+        <w:t>FAQ-AUTO-0089</w:t>
+      </w:r>
+    </w:p>
+    <w:p>
+      <w:pPr>
+        <w:pStyle w:val="ListBullet"/>
+      </w:pPr>
+      <w:r>
+        <w:t>DIALOGUE-AUTO-0030</w:t>
       </w:r>
     </w:p>
     <w:p>
@@ -648,6 +1840,389 @@
         <w:pStyle w:val="Heading2"/>
       </w:pPr>
       <w:r>
+        <w:t>Referências</w:t>
+      </w:r>
+    </w:p>
+    <w:p>
+      <w:pPr>
+        <w:pStyle w:val="ListBullet"/>
+      </w:pPr>
+      <w:r>
+        <w:t>Documento interno: `EDITORIAL_RULES.md`</w:t>
+      </w:r>
+    </w:p>
+    <w:p>
+      <w:pPr>
+        <w:pStyle w:val="Heading2"/>
+      </w:pPr>
+      <w:r>
+        <w:t>Tags</w:t>
+      </w:r>
+    </w:p>
+    <w:p>
+      <w:pPr>
+        <w:pStyle w:val="ListBullet"/>
+      </w:pPr>
+      <w:r>
+        <w:t>case</w:t>
+      </w:r>
+    </w:p>
+    <w:p>
+      <w:pPr>
+        <w:pStyle w:val="ListBullet"/>
+      </w:pPr>
+      <w:r>
+        <w:t>auto</w:t>
+      </w:r>
+    </w:p>
+    <w:p>
+      <w:pPr>
+        <w:pStyle w:val="ListBullet"/>
+      </w:pPr>
+      <w:r>
+        <w:t>atendimento</w:t>
+      </w:r>
+    </w:p>
+    <w:p>
+      <w:pPr>
+        <w:pStyle w:val="ListBullet"/>
+      </w:pPr>
+      <w:r>
+        <w:t>revisao</w:t>
+      </w:r>
+    </w:p>
+    <w:p>
+      <w:pPr>
+        <w:pStyle w:val="Heading2"/>
+      </w:pPr>
+      <w:r>
+        <w:t>Veja também</w:t>
+      </w:r>
+    </w:p>
+    <w:p>
+      <w:pPr>
+        <w:pStyle w:val="ListBullet"/>
+      </w:pPr>
+      <w:r>
+        <w:t>`14_FAQ/AUTO/FAQ-AUTO-0088.md`</w:t>
+      </w:r>
+    </w:p>
+    <w:p>
+      <w:pPr>
+        <w:pStyle w:val="Heading2"/>
+      </w:pPr>
+      <w:r>
+        <w:t>Histórico de revisão</w:t>
+      </w:r>
+    </w:p>
+    <w:tbl>
+      <w:tblPr>
+        <w:tblStyle w:val="TableGrid"/>
+        <w:tblW w:type="auto" w:w="0"/>
+        <w:tblLook w:firstColumn="1" w:firstRow="1" w:lastColumn="0" w:lastRow="0" w:noHBand="0" w:noVBand="1" w:val="04A0"/>
+      </w:tblPr>
+      <w:tblGrid>
+        <w:gridCol w:w="2448"/>
+        <w:gridCol w:w="2448"/>
+        <w:gridCol w:w="2448"/>
+        <w:gridCol w:w="2448"/>
+      </w:tblGrid>
+      <w:tr>
+        <w:tc>
+          <w:tcPr>
+            <w:tcW w:type="dxa" w:w="2448"/>
+          </w:tcPr>
+          <w:p>
+            <w:r>
+              <w:t>Data</w:t>
+            </w:r>
+          </w:p>
+        </w:tc>
+        <w:tc>
+          <w:tcPr>
+            <w:tcW w:type="dxa" w:w="2448"/>
+          </w:tcPr>
+          <w:p>
+            <w:r>
+              <w:t>Versão</w:t>
+            </w:r>
+          </w:p>
+        </w:tc>
+        <w:tc>
+          <w:tcPr>
+            <w:tcW w:type="dxa" w:w="2448"/>
+          </w:tcPr>
+          <w:p>
+            <w:r>
+              <w:t>Autor</w:t>
+            </w:r>
+          </w:p>
+        </w:tc>
+        <w:tc>
+          <w:tcPr>
+            <w:tcW w:type="dxa" w:w="2448"/>
+          </w:tcPr>
+          <w:p>
+            <w:r>
+              <w:t>Alteração</w:t>
+            </w:r>
+          </w:p>
+        </w:tc>
+      </w:tr>
+      <w:tr>
+        <w:tc>
+          <w:tcPr>
+            <w:tcW w:type="dxa" w:w="2448"/>
+          </w:tcPr>
+          <w:p>
+            <w:r>
+              <w:t>2026-06-25</w:t>
+            </w:r>
+          </w:p>
+        </w:tc>
+        <w:tc>
+          <w:tcPr>
+            <w:tcW w:type="dxa" w:w="2448"/>
+          </w:tcPr>
+          <w:p>
+            <w:r>
+              <w:t>0.1</w:t>
+            </w:r>
+          </w:p>
+        </w:tc>
+        <w:tc>
+          <w:tcPr>
+            <w:tcW w:type="dxa" w:w="2448"/>
+          </w:tcPr>
+          <w:p>
+            <w:r>
+              <w:t>JP-BR Insurance Knowledge Base</w:t>
+            </w:r>
+          </w:p>
+        </w:tc>
+        <w:tc>
+          <w:tcPr>
+            <w:tcW w:type="dxa" w:w="2448"/>
+          </w:tcPr>
+          <w:p>
+            <w:r>
+              <w:t>Criação inicial.</w:t>
+            </w:r>
+          </w:p>
+        </w:tc>
+      </w:tr>
+    </w:tbl>
+    <w:p/>
+    <w:p>
+      <w:r>
+        <w:t>---</w:t>
+      </w:r>
+    </w:p>
+    <w:p>
+      <w:pPr>
+        <w:pStyle w:val="Heading1"/>
+      </w:pPr>
+      <w:r>
+        <w:t>CASE-AUTO-0041 - Seguradora pede confirmação de identidade e documentos</w:t>
+      </w:r>
+    </w:p>
+    <w:p>
+      <w:pPr>
+        <w:pStyle w:val="Heading2"/>
+      </w:pPr>
+      <w:r>
+        <w:t>Controle</w:t>
+      </w:r>
+    </w:p>
+    <w:p>
+      <w:pPr>
+        <w:pStyle w:val="ListBullet"/>
+      </w:pPr>
+      <w:r>
+        <w:t>Versão: 0.1</w:t>
+      </w:r>
+    </w:p>
+    <w:p>
+      <w:pPr>
+        <w:pStyle w:val="ListBullet"/>
+      </w:pPr>
+      <w:r>
+        <w:t>Data: 2026-06-25</w:t>
+      </w:r>
+    </w:p>
+    <w:p>
+      <w:pPr>
+        <w:pStyle w:val="ListBullet"/>
+      </w:pPr>
+      <w:r>
+        <w:t>Autor: JP-BR Insurance Knowledge Base</w:t>
+      </w:r>
+    </w:p>
+    <w:p>
+      <w:pPr>
+        <w:pStyle w:val="ListBullet"/>
+      </w:pPr>
+      <w:r>
+        <w:t>Histórico: Criação inicial.</w:t>
+      </w:r>
+    </w:p>
+    <w:p>
+      <w:pPr>
+        <w:pStyle w:val="Heading2"/>
+      </w:pPr>
+      <w:r>
+        <w:t>Código</w:t>
+      </w:r>
+    </w:p>
+    <w:p>
+      <w:r>
+        <w:t>CASE-AUTO-0041</w:t>
+      </w:r>
+    </w:p>
+    <w:p>
+      <w:pPr>
+        <w:pStyle w:val="Heading2"/>
+      </w:pPr>
+      <w:r>
+        <w:t>Produto ou categoria</w:t>
+      </w:r>
+    </w:p>
+    <w:p>
+      <w:r>
+        <w:t>AUTO</w:t>
+      </w:r>
+    </w:p>
+    <w:p>
+      <w:pPr>
+        <w:pStyle w:val="Heading2"/>
+      </w:pPr>
+      <w:r>
+        <w:t>Situação</w:t>
+      </w:r>
+    </w:p>
+    <w:p>
+      <w:r>
+        <w:t>Seguradora pede confirmação de identidade e documentos.</w:t>
+      </w:r>
+    </w:p>
+    <w:p>
+      <w:pPr>
+        <w:pStyle w:val="Heading2"/>
+      </w:pPr>
+      <w:r>
+        <w:t>Problema</w:t>
+      </w:r>
+    </w:p>
+    <w:p>
+      <w:r>
+        <w:t>Cliente pode manter contrato desatualizado, interpretar resumo como contrato completo ou perder prazo importante por falta de acompanhamento.</w:t>
+      </w:r>
+    </w:p>
+    <w:p>
+      <w:pPr>
+        <w:pStyle w:val="Heading2"/>
+      </w:pPr>
+      <w:r>
+        <w:t>Análise</w:t>
+      </w:r>
+    </w:p>
+    <w:p>
+      <w:r>
+        <w:t>Atendimento recorrente, conferência de dados, revisão de cobertura e controle de vencimento reduzem riscos comerciais e operacionais.</w:t>
+      </w:r>
+    </w:p>
+    <w:p>
+      <w:pPr>
+        <w:pStyle w:val="Heading2"/>
+      </w:pPr>
+      <w:r>
+        <w:t>Orientação ao corretor</w:t>
+      </w:r>
+    </w:p>
+    <w:p>
+      <w:r>
+        <w:t>Revisar dados e coberturas com método, registrar mudanças e orientar o cliente antes de vencimento, cancelamento ou sinistro.</w:t>
+      </w:r>
+    </w:p>
+    <w:p>
+      <w:pPr>
+        <w:pStyle w:val="Heading2"/>
+      </w:pPr>
+      <w:r>
+        <w:t>Como explicar ao cliente brasileiro</w:t>
+      </w:r>
+    </w:p>
+    <w:p>
+      <w:r>
+        <w:t>Vamos manter seu seguro atualizado para evitar surpresa quando você precisar usar ou renovar.</w:t>
+      </w:r>
+    </w:p>
+    <w:p>
+      <w:pPr>
+        <w:pStyle w:val="Heading2"/>
+      </w:pPr>
+      <w:r>
+        <w:t>Resultado esperado</w:t>
+      </w:r>
+    </w:p>
+    <w:p>
+      <w:r>
+        <w:t>Cliente mantém contrato correto, entende o processo e recebe acompanhamento profissional depois da venda.</w:t>
+      </w:r>
+    </w:p>
+    <w:p>
+      <w:pPr>
+        <w:pStyle w:val="Heading2"/>
+      </w:pPr>
+      <w:r>
+        <w:t>Termos relacionados</w:t>
+      </w:r>
+    </w:p>
+    <w:p>
+      <w:pPr>
+        <w:pStyle w:val="ListBullet"/>
+      </w:pPr>
+      <w:r>
+        <w:t>AUTO-0092 - 必要書類 - Documentos necessários</w:t>
+      </w:r>
+    </w:p>
+    <w:p>
+      <w:pPr>
+        <w:pStyle w:val="ListBullet"/>
+      </w:pPr>
+      <w:r>
+        <w:t>AUTO-0093 - 本人確認 - Confirmação de identidade</w:t>
+      </w:r>
+    </w:p>
+    <w:p>
+      <w:pPr>
+        <w:pStyle w:val="Heading2"/>
+      </w:pPr>
+      <w:r>
+        <w:t>FAQs relacionadas</w:t>
+      </w:r>
+    </w:p>
+    <w:p>
+      <w:pPr>
+        <w:pStyle w:val="ListBullet"/>
+      </w:pPr>
+      <w:r>
+        <w:t>FAQ-AUTO-0089</w:t>
+      </w:r>
+    </w:p>
+    <w:p>
+      <w:pPr>
+        <w:pStyle w:val="ListBullet"/>
+      </w:pPr>
+      <w:r>
+        <w:t>FAQ-AUTO-0090</w:t>
+      </w:r>
+    </w:p>
+    <w:p>
+      <w:pPr>
+        <w:pStyle w:val="Heading2"/>
+      </w:pPr>
+      <w:r>
         <w:t>Diálogos relacionados</w:t>
       </w:r>
     </w:p>
@@ -656,7 +2231,7 @@
         <w:pStyle w:val="ListBullet"/>
       </w:pPr>
       <w:r>
-        <w:t>DIALOGUE-AUTO-0028</w:t>
+        <w:t>DIALOGUE-AUTO-0030</w:t>
       </w:r>
     </w:p>
     <w:p>
@@ -672,7 +2247,7 @@
         <w:pStyle w:val="ListBullet"/>
       </w:pPr>
       <w:r>
-        <w:t>AUTO-0084</w:t>
+        <w:t>AUTO-0092</w:t>
       </w:r>
     </w:p>
     <w:p>
@@ -680,7 +2255,7 @@
         <w:pStyle w:val="ListBullet"/>
       </w:pPr>
       <w:r>
-        <w:t>AUTO-0085</w:t>
+        <w:t>AUTO-0093</w:t>
       </w:r>
     </w:p>
     <w:p>
@@ -688,7 +2263,7 @@
         <w:pStyle w:val="ListBullet"/>
       </w:pPr>
       <w:r>
-        <w:t>AUTO-0086</w:t>
+        <w:t>FAQ-AUTO-0089</w:t>
       </w:r>
     </w:p>
     <w:p>
@@ -696,7 +2271,7 @@
         <w:pStyle w:val="ListBullet"/>
       </w:pPr>
       <w:r>
-        <w:t>AUTO-0087</w:t>
+        <w:t>FAQ-AUTO-0090</w:t>
       </w:r>
     </w:p>
     <w:p>
@@ -704,7 +2279,15 @@
         <w:pStyle w:val="ListBullet"/>
       </w:pPr>
       <w:r>
-        <w:t>FAQ-AUTO-0081</w:t>
+        <w:t>DIALOGUE-AUTO-0030</w:t>
+      </w:r>
+    </w:p>
+    <w:p>
+      <w:pPr>
+        <w:pStyle w:val="Heading2"/>
+      </w:pPr>
+      <w:r>
+        <w:t>Referências</w:t>
       </w:r>
     </w:p>
     <w:p>
@@ -712,7 +2295,15 @@
         <w:pStyle w:val="ListBullet"/>
       </w:pPr>
       <w:r>
-        <w:t>FAQ-AUTO-0082</w:t>
+        <w:t>Documento interno: `EDITORIAL_RULES.md`</w:t>
+      </w:r>
+    </w:p>
+    <w:p>
+      <w:pPr>
+        <w:pStyle w:val="Heading2"/>
+      </w:pPr>
+      <w:r>
+        <w:t>Tags</w:t>
       </w:r>
     </w:p>
     <w:p>
@@ -720,7 +2311,7 @@
         <w:pStyle w:val="ListBullet"/>
       </w:pPr>
       <w:r>
-        <w:t>FAQ-AUTO-0083</w:t>
+        <w:t>case</w:t>
       </w:r>
     </w:p>
     <w:p>
@@ -728,7 +2319,7 @@
         <w:pStyle w:val="ListBullet"/>
       </w:pPr>
       <w:r>
-        <w:t>FAQ-AUTO-0084</w:t>
+        <w:t>auto</w:t>
       </w:r>
     </w:p>
     <w:p>
@@ -736,7 +2327,15 @@
         <w:pStyle w:val="ListBullet"/>
       </w:pPr>
       <w:r>
-        <w:t>DIALOGUE-AUTO-0028</w:t>
+        <w:t>atendimento</w:t>
+      </w:r>
+    </w:p>
+    <w:p>
+      <w:pPr>
+        <w:pStyle w:val="ListBullet"/>
+      </w:pPr>
+      <w:r>
+        <w:t>revisao</w:t>
       </w:r>
     </w:p>
     <w:p>
@@ -744,6 +2343,429 @@
         <w:pStyle w:val="Heading2"/>
       </w:pPr>
       <w:r>
+        <w:t>Veja também</w:t>
+      </w:r>
+    </w:p>
+    <w:p>
+      <w:pPr>
+        <w:pStyle w:val="ListBullet"/>
+      </w:pPr>
+      <w:r>
+        <w:t>`14_FAQ/AUTO/FAQ-AUTO-0089.md`</w:t>
+      </w:r>
+    </w:p>
+    <w:p>
+      <w:pPr>
+        <w:pStyle w:val="Heading2"/>
+      </w:pPr>
+      <w:r>
+        <w:t>Histórico de revisão</w:t>
+      </w:r>
+    </w:p>
+    <w:tbl>
+      <w:tblPr>
+        <w:tblStyle w:val="TableGrid"/>
+        <w:tblW w:type="auto" w:w="0"/>
+        <w:tblLook w:firstColumn="1" w:firstRow="1" w:lastColumn="0" w:lastRow="0" w:noHBand="0" w:noVBand="1" w:val="04A0"/>
+      </w:tblPr>
+      <w:tblGrid>
+        <w:gridCol w:w="2448"/>
+        <w:gridCol w:w="2448"/>
+        <w:gridCol w:w="2448"/>
+        <w:gridCol w:w="2448"/>
+      </w:tblGrid>
+      <w:tr>
+        <w:tc>
+          <w:tcPr>
+            <w:tcW w:type="dxa" w:w="2448"/>
+          </w:tcPr>
+          <w:p>
+            <w:r>
+              <w:t>Data</w:t>
+            </w:r>
+          </w:p>
+        </w:tc>
+        <w:tc>
+          <w:tcPr>
+            <w:tcW w:type="dxa" w:w="2448"/>
+          </w:tcPr>
+          <w:p>
+            <w:r>
+              <w:t>Versão</w:t>
+            </w:r>
+          </w:p>
+        </w:tc>
+        <w:tc>
+          <w:tcPr>
+            <w:tcW w:type="dxa" w:w="2448"/>
+          </w:tcPr>
+          <w:p>
+            <w:r>
+              <w:t>Autor</w:t>
+            </w:r>
+          </w:p>
+        </w:tc>
+        <w:tc>
+          <w:tcPr>
+            <w:tcW w:type="dxa" w:w="2448"/>
+          </w:tcPr>
+          <w:p>
+            <w:r>
+              <w:t>Alteração</w:t>
+            </w:r>
+          </w:p>
+        </w:tc>
+      </w:tr>
+      <w:tr>
+        <w:tc>
+          <w:tcPr>
+            <w:tcW w:type="dxa" w:w="2448"/>
+          </w:tcPr>
+          <w:p>
+            <w:r>
+              <w:t>2026-06-25</w:t>
+            </w:r>
+          </w:p>
+        </w:tc>
+        <w:tc>
+          <w:tcPr>
+            <w:tcW w:type="dxa" w:w="2448"/>
+          </w:tcPr>
+          <w:p>
+            <w:r>
+              <w:t>0.1</w:t>
+            </w:r>
+          </w:p>
+        </w:tc>
+        <w:tc>
+          <w:tcPr>
+            <w:tcW w:type="dxa" w:w="2448"/>
+          </w:tcPr>
+          <w:p>
+            <w:r>
+              <w:t>JP-BR Insurance Knowledge Base</w:t>
+            </w:r>
+          </w:p>
+        </w:tc>
+        <w:tc>
+          <w:tcPr>
+            <w:tcW w:type="dxa" w:w="2448"/>
+          </w:tcPr>
+          <w:p>
+            <w:r>
+              <w:t>Criação inicial.</w:t>
+            </w:r>
+          </w:p>
+        </w:tc>
+      </w:tr>
+    </w:tbl>
+    <w:p/>
+    <w:p>
+      <w:r>
+        <w:t>---</w:t>
+      </w:r>
+    </w:p>
+    <w:p>
+      <w:pPr>
+        <w:pStyle w:val="Heading1"/>
+      </w:pPr>
+      <w:r>
+        <w:t>CASE-AUTO-0042 - Cliente mudou endereço, contato ou titularidade</w:t>
+      </w:r>
+    </w:p>
+    <w:p>
+      <w:pPr>
+        <w:pStyle w:val="Heading2"/>
+      </w:pPr>
+      <w:r>
+        <w:t>Controle</w:t>
+      </w:r>
+    </w:p>
+    <w:p>
+      <w:pPr>
+        <w:pStyle w:val="ListBullet"/>
+      </w:pPr>
+      <w:r>
+        <w:t>Versão: 0.1</w:t>
+      </w:r>
+    </w:p>
+    <w:p>
+      <w:pPr>
+        <w:pStyle w:val="ListBullet"/>
+      </w:pPr>
+      <w:r>
+        <w:t>Data: 2026-06-25</w:t>
+      </w:r>
+    </w:p>
+    <w:p>
+      <w:pPr>
+        <w:pStyle w:val="ListBullet"/>
+      </w:pPr>
+      <w:r>
+        <w:t>Autor: JP-BR Insurance Knowledge Base</w:t>
+      </w:r>
+    </w:p>
+    <w:p>
+      <w:pPr>
+        <w:pStyle w:val="ListBullet"/>
+      </w:pPr>
+      <w:r>
+        <w:t>Histórico: Criação inicial.</w:t>
+      </w:r>
+    </w:p>
+    <w:p>
+      <w:pPr>
+        <w:pStyle w:val="Heading2"/>
+      </w:pPr>
+      <w:r>
+        <w:t>Código</w:t>
+      </w:r>
+    </w:p>
+    <w:p>
+      <w:r>
+        <w:t>CASE-AUTO-0042</w:t>
+      </w:r>
+    </w:p>
+    <w:p>
+      <w:pPr>
+        <w:pStyle w:val="Heading2"/>
+      </w:pPr>
+      <w:r>
+        <w:t>Produto ou categoria</w:t>
+      </w:r>
+    </w:p>
+    <w:p>
+      <w:r>
+        <w:t>AUTO</w:t>
+      </w:r>
+    </w:p>
+    <w:p>
+      <w:pPr>
+        <w:pStyle w:val="Heading2"/>
+      </w:pPr>
+      <w:r>
+        <w:t>Situação</w:t>
+      </w:r>
+    </w:p>
+    <w:p>
+      <w:r>
+        <w:t>Cliente mudou endereço, contato ou titularidade.</w:t>
+      </w:r>
+    </w:p>
+    <w:p>
+      <w:pPr>
+        <w:pStyle w:val="Heading2"/>
+      </w:pPr>
+      <w:r>
+        <w:t>Problema</w:t>
+      </w:r>
+    </w:p>
+    <w:p>
+      <w:r>
+        <w:t>Cliente pode manter contrato desatualizado, interpretar resumo como contrato completo ou perder prazo importante por falta de acompanhamento.</w:t>
+      </w:r>
+    </w:p>
+    <w:p>
+      <w:pPr>
+        <w:pStyle w:val="Heading2"/>
+      </w:pPr>
+      <w:r>
+        <w:t>Análise</w:t>
+      </w:r>
+    </w:p>
+    <w:p>
+      <w:r>
+        <w:t>Atendimento recorrente, conferência de dados, revisão de cobertura e controle de vencimento reduzem riscos comerciais e operacionais.</w:t>
+      </w:r>
+    </w:p>
+    <w:p>
+      <w:pPr>
+        <w:pStyle w:val="Heading2"/>
+      </w:pPr>
+      <w:r>
+        <w:t>Orientação ao corretor</w:t>
+      </w:r>
+    </w:p>
+    <w:p>
+      <w:r>
+        <w:t>Revisar dados e coberturas com método, registrar mudanças e orientar o cliente antes de vencimento, cancelamento ou sinistro.</w:t>
+      </w:r>
+    </w:p>
+    <w:p>
+      <w:pPr>
+        <w:pStyle w:val="Heading2"/>
+      </w:pPr>
+      <w:r>
+        <w:t>Como explicar ao cliente brasileiro</w:t>
+      </w:r>
+    </w:p>
+    <w:p>
+      <w:r>
+        <w:t>Vamos manter seu seguro atualizado para evitar surpresa quando você precisar usar ou renovar.</w:t>
+      </w:r>
+    </w:p>
+    <w:p>
+      <w:pPr>
+        <w:pStyle w:val="Heading2"/>
+      </w:pPr>
+      <w:r>
+        <w:t>Resultado esperado</w:t>
+      </w:r>
+    </w:p>
+    <w:p>
+      <w:r>
+        <w:t>Cliente mantém contrato correto, entende o processo e recebe acompanhamento profissional depois da venda.</w:t>
+      </w:r>
+    </w:p>
+    <w:p>
+      <w:pPr>
+        <w:pStyle w:val="Heading2"/>
+      </w:pPr>
+      <w:r>
+        <w:t>Termos relacionados</w:t>
+      </w:r>
+    </w:p>
+    <w:p>
+      <w:pPr>
+        <w:pStyle w:val="ListBullet"/>
+      </w:pPr>
+      <w:r>
+        <w:t>AUTO-0094 - 住所変更 - Alteração de endereço</w:t>
+      </w:r>
+    </w:p>
+    <w:p>
+      <w:pPr>
+        <w:pStyle w:val="ListBullet"/>
+      </w:pPr>
+      <w:r>
+        <w:t>AUTO-0095 - 連絡先変更 - Alteração de contato</w:t>
+      </w:r>
+    </w:p>
+    <w:p>
+      <w:pPr>
+        <w:pStyle w:val="ListBullet"/>
+      </w:pPr>
+      <w:r>
+        <w:t>AUTO-0096 - 名義変更 - Alteração de titularidade</w:t>
+      </w:r>
+    </w:p>
+    <w:p>
+      <w:pPr>
+        <w:pStyle w:val="Heading2"/>
+      </w:pPr>
+      <w:r>
+        <w:t>FAQs relacionadas</w:t>
+      </w:r>
+    </w:p>
+    <w:p>
+      <w:pPr>
+        <w:pStyle w:val="ListBullet"/>
+      </w:pPr>
+      <w:r>
+        <w:t>FAQ-AUTO-0091</w:t>
+      </w:r>
+    </w:p>
+    <w:p>
+      <w:pPr>
+        <w:pStyle w:val="ListBullet"/>
+      </w:pPr>
+      <w:r>
+        <w:t>FAQ-AUTO-0092</w:t>
+      </w:r>
+    </w:p>
+    <w:p>
+      <w:pPr>
+        <w:pStyle w:val="ListBullet"/>
+      </w:pPr>
+      <w:r>
+        <w:t>FAQ-AUTO-0093</w:t>
+      </w:r>
+    </w:p>
+    <w:p>
+      <w:pPr>
+        <w:pStyle w:val="Heading2"/>
+      </w:pPr>
+      <w:r>
+        <w:t>Diálogos relacionados</w:t>
+      </w:r>
+    </w:p>
+    <w:p>
+      <w:pPr>
+        <w:pStyle w:val="ListBullet"/>
+      </w:pPr>
+      <w:r>
+        <w:t>DIALOGUE-AUTO-0031</w:t>
+      </w:r>
+    </w:p>
+    <w:p>
+      <w:pPr>
+        <w:pStyle w:val="Heading2"/>
+      </w:pPr>
+      <w:r>
+        <w:t>Referências cruzadas</w:t>
+      </w:r>
+    </w:p>
+    <w:p>
+      <w:pPr>
+        <w:pStyle w:val="ListBullet"/>
+      </w:pPr>
+      <w:r>
+        <w:t>AUTO-0094</w:t>
+      </w:r>
+    </w:p>
+    <w:p>
+      <w:pPr>
+        <w:pStyle w:val="ListBullet"/>
+      </w:pPr>
+      <w:r>
+        <w:t>AUTO-0095</w:t>
+      </w:r>
+    </w:p>
+    <w:p>
+      <w:pPr>
+        <w:pStyle w:val="ListBullet"/>
+      </w:pPr>
+      <w:r>
+        <w:t>AUTO-0096</w:t>
+      </w:r>
+    </w:p>
+    <w:p>
+      <w:pPr>
+        <w:pStyle w:val="ListBullet"/>
+      </w:pPr>
+      <w:r>
+        <w:t>FAQ-AUTO-0091</w:t>
+      </w:r>
+    </w:p>
+    <w:p>
+      <w:pPr>
+        <w:pStyle w:val="ListBullet"/>
+      </w:pPr>
+      <w:r>
+        <w:t>FAQ-AUTO-0092</w:t>
+      </w:r>
+    </w:p>
+    <w:p>
+      <w:pPr>
+        <w:pStyle w:val="ListBullet"/>
+      </w:pPr>
+      <w:r>
+        <w:t>FAQ-AUTO-0093</w:t>
+      </w:r>
+    </w:p>
+    <w:p>
+      <w:pPr>
+        <w:pStyle w:val="ListBullet"/>
+      </w:pPr>
+      <w:r>
+        <w:t>DIALOGUE-AUTO-0031</w:t>
+      </w:r>
+    </w:p>
+    <w:p>
+      <w:pPr>
+        <w:pStyle w:val="Heading2"/>
+      </w:pPr>
+      <w:r>
         <w:t>Referências</w:t>
       </w:r>
     </w:p>
@@ -808,7 +2830,7 @@
         <w:pStyle w:val="ListBullet"/>
       </w:pPr>
       <w:r>
-        <w:t>`14_FAQ/AUTO/FAQ-AUTO-0081.md`</w:t>
+        <w:t>`14_FAQ/AUTO/FAQ-AUTO-0091.md`</w:t>
       </w:r>
     </w:p>
     <w:p>
@@ -819,24 +2841,107 @@
         <w:t>Histórico de revisão</w:t>
       </w:r>
     </w:p>
-    <w:p>
-      <w:r>
-        <w:t>| Data | Versão | Autor | Alteração |</w:t>
-      </w:r>
-    </w:p>
-    <w:p>
-      <w:r>
-        <w:t>| --- | --- | --- | --- |</w:t>
-      </w:r>
-    </w:p>
-    <w:p>
-      <w:r>
-        <w:t>| 2026-06-25 | 0.1 | JP-BR Insurance Knowledge Base | Criação inicial. |</w:t>
-      </w:r>
-    </w:p>
-    <w:p>
-      <w:r>
-        <w:t>————————————————————————</w:t>
+    <w:tbl>
+      <w:tblPr>
+        <w:tblStyle w:val="TableGrid"/>
+        <w:tblW w:type="auto" w:w="0"/>
+        <w:tblLook w:firstColumn="1" w:firstRow="1" w:lastColumn="0" w:lastRow="0" w:noHBand="0" w:noVBand="1" w:val="04A0"/>
+      </w:tblPr>
+      <w:tblGrid>
+        <w:gridCol w:w="2448"/>
+        <w:gridCol w:w="2448"/>
+        <w:gridCol w:w="2448"/>
+        <w:gridCol w:w="2448"/>
+      </w:tblGrid>
+      <w:tr>
+        <w:tc>
+          <w:tcPr>
+            <w:tcW w:type="dxa" w:w="2448"/>
+          </w:tcPr>
+          <w:p>
+            <w:r>
+              <w:t>Data</w:t>
+            </w:r>
+          </w:p>
+        </w:tc>
+        <w:tc>
+          <w:tcPr>
+            <w:tcW w:type="dxa" w:w="2448"/>
+          </w:tcPr>
+          <w:p>
+            <w:r>
+              <w:t>Versão</w:t>
+            </w:r>
+          </w:p>
+        </w:tc>
+        <w:tc>
+          <w:tcPr>
+            <w:tcW w:type="dxa" w:w="2448"/>
+          </w:tcPr>
+          <w:p>
+            <w:r>
+              <w:t>Autor</w:t>
+            </w:r>
+          </w:p>
+        </w:tc>
+        <w:tc>
+          <w:tcPr>
+            <w:tcW w:type="dxa" w:w="2448"/>
+          </w:tcPr>
+          <w:p>
+            <w:r>
+              <w:t>Alteração</w:t>
+            </w:r>
+          </w:p>
+        </w:tc>
+      </w:tr>
+      <w:tr>
+        <w:tc>
+          <w:tcPr>
+            <w:tcW w:type="dxa" w:w="2448"/>
+          </w:tcPr>
+          <w:p>
+            <w:r>
+              <w:t>2026-06-25</w:t>
+            </w:r>
+          </w:p>
+        </w:tc>
+        <w:tc>
+          <w:tcPr>
+            <w:tcW w:type="dxa" w:w="2448"/>
+          </w:tcPr>
+          <w:p>
+            <w:r>
+              <w:t>0.1</w:t>
+            </w:r>
+          </w:p>
+        </w:tc>
+        <w:tc>
+          <w:tcPr>
+            <w:tcW w:type="dxa" w:w="2448"/>
+          </w:tcPr>
+          <w:p>
+            <w:r>
+              <w:t>JP-BR Insurance Knowledge Base</w:t>
+            </w:r>
+          </w:p>
+        </w:tc>
+        <w:tc>
+          <w:tcPr>
+            <w:tcW w:type="dxa" w:w="2448"/>
+          </w:tcPr>
+          <w:p>
+            <w:r>
+              <w:t>Criação inicial.</w:t>
+            </w:r>
+          </w:p>
+        </w:tc>
+      </w:tr>
+    </w:tbl>
+    <w:p/>
+    <w:p>
+      <w:r>
+        <w:t>---</w:t>
       </w:r>
     </w:p>
     <w:p>
@@ -844,7 +2949,7 @@
         <w:pStyle w:val="Heading1"/>
       </w:pPr>
       <w:r>
-        <w:t>CASE-AUTO-0039 - Dados do cliente, veículo ou condutor estão incorretos</w:t>
+        <w:t>CASE-AUTO-0043 - Cliente quer cancelar perto da renovação</w:t>
       </w:r>
     </w:p>
     <w:p>
@@ -897,7 +3002,7 @@
     </w:p>
     <w:p>
       <w:r>
-        <w:t>CASE-AUTO-0039</w:t>
+        <w:t>CASE-AUTO-0043</w:t>
       </w:r>
     </w:p>
     <w:p>
@@ -923,7 +3028,7 @@
     </w:p>
     <w:p>
       <w:r>
-        <w:t>Dados do cliente, veículo ou condutor estão incorretos.</w:t>
+        <w:t>Cliente quer cancelar perto da renovação.</w:t>
       </w:r>
     </w:p>
     <w:p>
@@ -1004,7 +3109,7 @@
         <w:pStyle w:val="ListBullet"/>
       </w:pPr>
       <w:r>
-        <w:t>AUTO-0088 - 顧客情報 - Informações do cliente</w:t>
+        <w:t>AUTO-0097 - 解約手続き - Procedimento de cancelamento</w:t>
       </w:r>
     </w:p>
     <w:p>
@@ -1012,7 +3117,7 @@
         <w:pStyle w:val="ListBullet"/>
       </w:pPr>
       <w:r>
-        <w:t>AUTO-0089 - 車両情報 - Informações do veículo</w:t>
+        <w:t>AUTO-0098 - 更新案内 - Aviso de renovação</w:t>
       </w:r>
     </w:p>
     <w:p>
@@ -1020,7 +3125,7 @@
         <w:pStyle w:val="ListBullet"/>
       </w:pPr>
       <w:r>
-        <w:t>AUTO-0090 - 運転者情報 - Informações do condutor</w:t>
+        <w:t>AUTO-0099 - 満期管理 - Controle de vencimento</w:t>
       </w:r>
     </w:p>
     <w:p>
@@ -1036,7 +3141,7 @@
         <w:pStyle w:val="ListBullet"/>
       </w:pPr>
       <w:r>
-        <w:t>FAQ-AUTO-0085</w:t>
+        <w:t>FAQ-AUTO-0094</w:t>
       </w:r>
     </w:p>
     <w:p>
@@ -1044,7 +3149,7 @@
         <w:pStyle w:val="ListBullet"/>
       </w:pPr>
       <w:r>
-        <w:t>FAQ-AUTO-0086</w:t>
+        <w:t>FAQ-AUTO-0095</w:t>
       </w:r>
     </w:p>
     <w:p>
@@ -1052,7 +3157,7 @@
         <w:pStyle w:val="ListBullet"/>
       </w:pPr>
       <w:r>
-        <w:t>FAQ-AUTO-0087</w:t>
+        <w:t>FAQ-AUTO-0096</w:t>
       </w:r>
     </w:p>
     <w:p>
@@ -1068,7 +3173,7 @@
         <w:pStyle w:val="ListBullet"/>
       </w:pPr>
       <w:r>
-        <w:t>DIALOGUE-AUTO-0029</w:t>
+        <w:t>DIALOGUE-AUTO-0032</w:t>
       </w:r>
     </w:p>
     <w:p>
@@ -1084,7 +3189,7 @@
         <w:pStyle w:val="ListBullet"/>
       </w:pPr>
       <w:r>
-        <w:t>AUTO-0088</w:t>
+        <w:t>AUTO-0097</w:t>
       </w:r>
     </w:p>
     <w:p>
@@ -1092,7 +3197,7 @@
         <w:pStyle w:val="ListBullet"/>
       </w:pPr>
       <w:r>
-        <w:t>AUTO-0089</w:t>
+        <w:t>AUTO-0098</w:t>
       </w:r>
     </w:p>
     <w:p>
@@ -1100,7 +3205,7 @@
         <w:pStyle w:val="ListBullet"/>
       </w:pPr>
       <w:r>
-        <w:t>AUTO-0090</w:t>
+        <w:t>AUTO-0099</w:t>
       </w:r>
     </w:p>
     <w:p>
@@ -1108,7 +3213,7 @@
         <w:pStyle w:val="ListBullet"/>
       </w:pPr>
       <w:r>
-        <w:t>FAQ-AUTO-0085</w:t>
+        <w:t>FAQ-AUTO-0094</w:t>
       </w:r>
     </w:p>
     <w:p>
@@ -1116,7 +3221,7 @@
         <w:pStyle w:val="ListBullet"/>
       </w:pPr>
       <w:r>
-        <w:t>FAQ-AUTO-0086</w:t>
+        <w:t>FAQ-AUTO-0095</w:t>
       </w:r>
     </w:p>
     <w:p>
@@ -1124,7 +3229,7 @@
         <w:pStyle w:val="ListBullet"/>
       </w:pPr>
       <w:r>
-        <w:t>FAQ-AUTO-0087</w:t>
+        <w:t>FAQ-AUTO-0096</w:t>
       </w:r>
     </w:p>
     <w:p>
@@ -1132,7 +3237,7 @@
         <w:pStyle w:val="ListBullet"/>
       </w:pPr>
       <w:r>
-        <w:t>DIALOGUE-AUTO-0029</w:t>
+        <w:t>DIALOGUE-AUTO-0032</w:t>
       </w:r>
     </w:p>
     <w:p>
@@ -1204,7 +3309,7 @@
         <w:pStyle w:val="ListBullet"/>
       </w:pPr>
       <w:r>
-        <w:t>`14_FAQ/AUTO/FAQ-AUTO-0085.md`</w:t>
+        <w:t>`14_FAQ/AUTO/FAQ-AUTO-0094.md`</w:t>
       </w:r>
     </w:p>
     <w:p>
@@ -1215,24 +3320,107 @@
         <w:t>Histórico de revisão</w:t>
       </w:r>
     </w:p>
-    <w:p>
-      <w:r>
-        <w:t>| Data | Versão | Autor | Alteração |</w:t>
-      </w:r>
-    </w:p>
-    <w:p>
-      <w:r>
-        <w:t>| --- | --- | --- | --- |</w:t>
-      </w:r>
-    </w:p>
-    <w:p>
-      <w:r>
-        <w:t>| 2026-06-25 | 0.1 | JP-BR Insurance Knowledge Base | Criação inicial. |</w:t>
-      </w:r>
-    </w:p>
-    <w:p>
-      <w:r>
-        <w:t>————————————————————————</w:t>
+    <w:tbl>
+      <w:tblPr>
+        <w:tblStyle w:val="TableGrid"/>
+        <w:tblW w:type="auto" w:w="0"/>
+        <w:tblLook w:firstColumn="1" w:firstRow="1" w:lastColumn="0" w:lastRow="0" w:noHBand="0" w:noVBand="1" w:val="04A0"/>
+      </w:tblPr>
+      <w:tblGrid>
+        <w:gridCol w:w="2448"/>
+        <w:gridCol w:w="2448"/>
+        <w:gridCol w:w="2448"/>
+        <w:gridCol w:w="2448"/>
+      </w:tblGrid>
+      <w:tr>
+        <w:tc>
+          <w:tcPr>
+            <w:tcW w:type="dxa" w:w="2448"/>
+          </w:tcPr>
+          <w:p>
+            <w:r>
+              <w:t>Data</w:t>
+            </w:r>
+          </w:p>
+        </w:tc>
+        <w:tc>
+          <w:tcPr>
+            <w:tcW w:type="dxa" w:w="2448"/>
+          </w:tcPr>
+          <w:p>
+            <w:r>
+              <w:t>Versão</w:t>
+            </w:r>
+          </w:p>
+        </w:tc>
+        <w:tc>
+          <w:tcPr>
+            <w:tcW w:type="dxa" w:w="2448"/>
+          </w:tcPr>
+          <w:p>
+            <w:r>
+              <w:t>Autor</w:t>
+            </w:r>
+          </w:p>
+        </w:tc>
+        <w:tc>
+          <w:tcPr>
+            <w:tcW w:type="dxa" w:w="2448"/>
+          </w:tcPr>
+          <w:p>
+            <w:r>
+              <w:t>Alteração</w:t>
+            </w:r>
+          </w:p>
+        </w:tc>
+      </w:tr>
+      <w:tr>
+        <w:tc>
+          <w:tcPr>
+            <w:tcW w:type="dxa" w:w="2448"/>
+          </w:tcPr>
+          <w:p>
+            <w:r>
+              <w:t>2026-06-25</w:t>
+            </w:r>
+          </w:p>
+        </w:tc>
+        <w:tc>
+          <w:tcPr>
+            <w:tcW w:type="dxa" w:w="2448"/>
+          </w:tcPr>
+          <w:p>
+            <w:r>
+              <w:t>0.1</w:t>
+            </w:r>
+          </w:p>
+        </w:tc>
+        <w:tc>
+          <w:tcPr>
+            <w:tcW w:type="dxa" w:w="2448"/>
+          </w:tcPr>
+          <w:p>
+            <w:r>
+              <w:t>JP-BR Insurance Knowledge Base</w:t>
+            </w:r>
+          </w:p>
+        </w:tc>
+        <w:tc>
+          <w:tcPr>
+            <w:tcW w:type="dxa" w:w="2448"/>
+          </w:tcPr>
+          <w:p>
+            <w:r>
+              <w:t>Criação inicial.</w:t>
+            </w:r>
+          </w:p>
+        </w:tc>
+      </w:tr>
+    </w:tbl>
+    <w:p/>
+    <w:p>
+      <w:r>
+        <w:t>---</w:t>
       </w:r>
     </w:p>
     <w:p>
@@ -1240,7 +3428,7 @@
         <w:pStyle w:val="Heading1"/>
       </w:pPr>
       <w:r>
-        <w:t>CASE-AUTO-0040 - Cliente não sabe o fluxo correto após acidente</w:t>
+        <w:t>CASE-AUTO-0044 - Pós-venda evita vencimento e problemas futuros</w:t>
       </w:r>
     </w:p>
     <w:p>
@@ -1293,7 +3481,7 @@
     </w:p>
     <w:p>
       <w:r>
-        <w:t>CASE-AUTO-0040</w:t>
+        <w:t>CASE-AUTO-0044</w:t>
       </w:r>
     </w:p>
     <w:p>
@@ -1319,7 +3507,7 @@
     </w:p>
     <w:p>
       <w:r>
-        <w:t>Cliente não sabe o fluxo correto após acidente.</w:t>
+        <w:t>Pós-venda evita vencimento e problemas futuros.</w:t>
       </w:r>
     </w:p>
     <w:p>
@@ -1400,7 +3588,7 @@
         <w:pStyle w:val="ListBullet"/>
       </w:pPr>
       <w:r>
-        <w:t>AUTO-0091 - 事故対応フロー - Fluxo de atendimento em acidente</w:t>
+        <w:t>AUTO-0098 - 更新案内 - Aviso de renovação</w:t>
       </w:r>
     </w:p>
     <w:p>
@@ -1408,7 +3596,15 @@
         <w:pStyle w:val="ListBullet"/>
       </w:pPr>
       <w:r>
-        <w:t>AUTO-0092 - 必要書類 - Documentos necessários</w:t>
+        <w:t>AUTO-0099 - 満期管理 - Controle de vencimento</w:t>
+      </w:r>
+    </w:p>
+    <w:p>
+      <w:pPr>
+        <w:pStyle w:val="ListBullet"/>
+      </w:pPr>
+      <w:r>
+        <w:t>AUTO-0100 - アフターサービス - Atendimento pós-venda</w:t>
       </w:r>
     </w:p>
     <w:p>
@@ -1424,7 +3620,7 @@
         <w:pStyle w:val="ListBullet"/>
       </w:pPr>
       <w:r>
-        <w:t>FAQ-AUTO-0088</w:t>
+        <w:t>FAQ-AUTO-0095</w:t>
       </w:r>
     </w:p>
     <w:p>
@@ -1432,7 +3628,15 @@
         <w:pStyle w:val="ListBullet"/>
       </w:pPr>
       <w:r>
-        <w:t>FAQ-AUTO-0089</w:t>
+        <w:t>FAQ-AUTO-0096</w:t>
+      </w:r>
+    </w:p>
+    <w:p>
+      <w:pPr>
+        <w:pStyle w:val="ListBullet"/>
+      </w:pPr>
+      <w:r>
+        <w:t>FAQ-AUTO-0097</w:t>
       </w:r>
     </w:p>
     <w:p>
@@ -1448,7 +3652,7 @@
         <w:pStyle w:val="ListBullet"/>
       </w:pPr>
       <w:r>
-        <w:t>DIALOGUE-AUTO-0030</w:t>
+        <w:t>DIALOGUE-AUTO-0032</w:t>
       </w:r>
     </w:p>
     <w:p>
@@ -1464,7 +3668,7 @@
         <w:pStyle w:val="ListBullet"/>
       </w:pPr>
       <w:r>
-        <w:t>AUTO-0091</w:t>
+        <w:t>AUTO-0098</w:t>
       </w:r>
     </w:p>
     <w:p>
@@ -1472,7 +3676,7 @@
         <w:pStyle w:val="ListBullet"/>
       </w:pPr>
       <w:r>
-        <w:t>AUTO-0092</w:t>
+        <w:t>AUTO-0099</w:t>
       </w:r>
     </w:p>
     <w:p>
@@ -1480,7 +3684,7 @@
         <w:pStyle w:val="ListBullet"/>
       </w:pPr>
       <w:r>
-        <w:t>FAQ-AUTO-0088</w:t>
+        <w:t>AUTO-0100</w:t>
       </w:r>
     </w:p>
     <w:p>
@@ -1488,7 +3692,7 @@
         <w:pStyle w:val="ListBullet"/>
       </w:pPr>
       <w:r>
-        <w:t>FAQ-AUTO-0089</w:t>
+        <w:t>FAQ-AUTO-0095</w:t>
       </w:r>
     </w:p>
     <w:p>
@@ -1496,7 +3700,23 @@
         <w:pStyle w:val="ListBullet"/>
       </w:pPr>
       <w:r>
-        <w:t>DIALOGUE-AUTO-0030</w:t>
+        <w:t>FAQ-AUTO-0096</w:t>
+      </w:r>
+    </w:p>
+    <w:p>
+      <w:pPr>
+        <w:pStyle w:val="ListBullet"/>
+      </w:pPr>
+      <w:r>
+        <w:t>FAQ-AUTO-0097</w:t>
+      </w:r>
+    </w:p>
+    <w:p>
+      <w:pPr>
+        <w:pStyle w:val="ListBullet"/>
+      </w:pPr>
+      <w:r>
+        <w:t>DIALOGUE-AUTO-0032</w:t>
       </w:r>
     </w:p>
     <w:p>
@@ -1568,7 +3788,7 @@
         <w:pStyle w:val="ListBullet"/>
       </w:pPr>
       <w:r>
-        <w:t>`14_FAQ/AUTO/FAQ-AUTO-0088.md`</w:t>
+        <w:t>`14_FAQ/AUTO/FAQ-AUTO-0095.md`</w:t>
       </w:r>
     </w:p>
     <w:p>
@@ -1579,1576 +3799,107 @@
         <w:t>Histórico de revisão</w:t>
       </w:r>
     </w:p>
-    <w:p>
-      <w:r>
-        <w:t>| Data | Versão | Autor | Alteração |</w:t>
-      </w:r>
-    </w:p>
-    <w:p>
-      <w:r>
-        <w:t>| --- | --- | --- | --- |</w:t>
-      </w:r>
-    </w:p>
-    <w:p>
-      <w:r>
-        <w:t>| 2026-06-25 | 0.1 | JP-BR Insurance Knowledge Base | Criação inicial. |</w:t>
-      </w:r>
-    </w:p>
-    <w:p>
-      <w:r>
-        <w:t>————————————————————————</w:t>
-      </w:r>
-    </w:p>
-    <w:p>
-      <w:pPr>
-        <w:pStyle w:val="Heading1"/>
-      </w:pPr>
-      <w:r>
-        <w:t>CASE-AUTO-0041 - Seguradora pede confirmação de identidade e documentos</w:t>
-      </w:r>
-    </w:p>
-    <w:p>
-      <w:pPr>
-        <w:pStyle w:val="Heading2"/>
-      </w:pPr>
-      <w:r>
-        <w:t>Controle</w:t>
-      </w:r>
-    </w:p>
-    <w:p>
-      <w:pPr>
-        <w:pStyle w:val="ListBullet"/>
-      </w:pPr>
-      <w:r>
-        <w:t>Versão: 0.1</w:t>
-      </w:r>
-    </w:p>
-    <w:p>
-      <w:pPr>
-        <w:pStyle w:val="ListBullet"/>
-      </w:pPr>
-      <w:r>
-        <w:t>Data: 2026-06-25</w:t>
-      </w:r>
-    </w:p>
-    <w:p>
-      <w:pPr>
-        <w:pStyle w:val="ListBullet"/>
-      </w:pPr>
-      <w:r>
-        <w:t>Autor: JP-BR Insurance Knowledge Base</w:t>
-      </w:r>
-    </w:p>
-    <w:p>
-      <w:pPr>
-        <w:pStyle w:val="ListBullet"/>
-      </w:pPr>
-      <w:r>
-        <w:t>Histórico: Criação inicial.</w:t>
-      </w:r>
-    </w:p>
-    <w:p>
-      <w:pPr>
-        <w:pStyle w:val="Heading2"/>
-      </w:pPr>
-      <w:r>
-        <w:t>Código</w:t>
-      </w:r>
-    </w:p>
-    <w:p>
-      <w:r>
-        <w:t>CASE-AUTO-0041</w:t>
-      </w:r>
-    </w:p>
-    <w:p>
-      <w:pPr>
-        <w:pStyle w:val="Heading2"/>
-      </w:pPr>
-      <w:r>
-        <w:t>Produto ou categoria</w:t>
-      </w:r>
-    </w:p>
-    <w:p>
-      <w:r>
-        <w:t>AUTO</w:t>
-      </w:r>
-    </w:p>
-    <w:p>
-      <w:pPr>
-        <w:pStyle w:val="Heading2"/>
-      </w:pPr>
-      <w:r>
-        <w:t>Situação</w:t>
-      </w:r>
-    </w:p>
-    <w:p>
-      <w:r>
-        <w:t>Seguradora pede confirmação de identidade e documentos.</w:t>
-      </w:r>
-    </w:p>
-    <w:p>
-      <w:pPr>
-        <w:pStyle w:val="Heading2"/>
-      </w:pPr>
-      <w:r>
-        <w:t>Problema</w:t>
-      </w:r>
-    </w:p>
-    <w:p>
-      <w:r>
-        <w:t>Cliente pode manter contrato desatualizado, interpretar resumo como contrato completo ou perder prazo importante por falta de acompanhamento.</w:t>
-      </w:r>
-    </w:p>
-    <w:p>
-      <w:pPr>
-        <w:pStyle w:val="Heading2"/>
-      </w:pPr>
-      <w:r>
-        <w:t>Análise</w:t>
-      </w:r>
-    </w:p>
-    <w:p>
-      <w:r>
-        <w:t>Atendimento recorrente, conferência de dados, revisão de cobertura e controle de vencimento reduzem riscos comerciais e operacionais.</w:t>
-      </w:r>
-    </w:p>
-    <w:p>
-      <w:pPr>
-        <w:pStyle w:val="Heading2"/>
-      </w:pPr>
-      <w:r>
-        <w:t>Orientação ao corretor</w:t>
-      </w:r>
-    </w:p>
-    <w:p>
-      <w:r>
-        <w:t>Revisar dados e coberturas com método, registrar mudanças e orientar o cliente antes de vencimento, cancelamento ou sinistro.</w:t>
-      </w:r>
-    </w:p>
-    <w:p>
-      <w:pPr>
-        <w:pStyle w:val="Heading2"/>
-      </w:pPr>
-      <w:r>
-        <w:t>Como explicar ao cliente brasileiro</w:t>
-      </w:r>
-    </w:p>
-    <w:p>
-      <w:r>
-        <w:t>Vamos manter seu seguro atualizado para evitar surpresa quando você precisar usar ou renovar.</w:t>
-      </w:r>
-    </w:p>
-    <w:p>
-      <w:pPr>
-        <w:pStyle w:val="Heading2"/>
-      </w:pPr>
-      <w:r>
-        <w:t>Resultado esperado</w:t>
-      </w:r>
-    </w:p>
-    <w:p>
-      <w:r>
-        <w:t>Cliente mantém contrato correto, entende o processo e recebe acompanhamento profissional depois da venda.</w:t>
-      </w:r>
-    </w:p>
-    <w:p>
-      <w:pPr>
-        <w:pStyle w:val="Heading2"/>
-      </w:pPr>
-      <w:r>
-        <w:t>Termos relacionados</w:t>
-      </w:r>
-    </w:p>
-    <w:p>
-      <w:pPr>
-        <w:pStyle w:val="ListBullet"/>
-      </w:pPr>
-      <w:r>
-        <w:t>AUTO-0092 - 必要書類 - Documentos necessários</w:t>
-      </w:r>
-    </w:p>
-    <w:p>
-      <w:pPr>
-        <w:pStyle w:val="ListBullet"/>
-      </w:pPr>
-      <w:r>
-        <w:t>AUTO-0093 - 本人確認 - Confirmação de identidade</w:t>
-      </w:r>
-    </w:p>
-    <w:p>
-      <w:pPr>
-        <w:pStyle w:val="Heading2"/>
-      </w:pPr>
-      <w:r>
-        <w:t>FAQs relacionadas</w:t>
-      </w:r>
-    </w:p>
-    <w:p>
-      <w:pPr>
-        <w:pStyle w:val="ListBullet"/>
-      </w:pPr>
-      <w:r>
-        <w:t>FAQ-AUTO-0089</w:t>
-      </w:r>
-    </w:p>
-    <w:p>
-      <w:pPr>
-        <w:pStyle w:val="ListBullet"/>
-      </w:pPr>
-      <w:r>
-        <w:t>FAQ-AUTO-0090</w:t>
-      </w:r>
-    </w:p>
-    <w:p>
-      <w:pPr>
-        <w:pStyle w:val="Heading2"/>
-      </w:pPr>
-      <w:r>
-        <w:t>Diálogos relacionados</w:t>
-      </w:r>
-    </w:p>
-    <w:p>
-      <w:pPr>
-        <w:pStyle w:val="ListBullet"/>
-      </w:pPr>
-      <w:r>
-        <w:t>DIALOGUE-AUTO-0030</w:t>
-      </w:r>
-    </w:p>
-    <w:p>
-      <w:pPr>
-        <w:pStyle w:val="Heading2"/>
-      </w:pPr>
-      <w:r>
-        <w:t>Referências cruzadas</w:t>
-      </w:r>
-    </w:p>
-    <w:p>
-      <w:pPr>
-        <w:pStyle w:val="ListBullet"/>
-      </w:pPr>
-      <w:r>
-        <w:t>AUTO-0092</w:t>
-      </w:r>
-    </w:p>
-    <w:p>
-      <w:pPr>
-        <w:pStyle w:val="ListBullet"/>
-      </w:pPr>
-      <w:r>
-        <w:t>AUTO-0093</w:t>
-      </w:r>
-    </w:p>
-    <w:p>
-      <w:pPr>
-        <w:pStyle w:val="ListBullet"/>
-      </w:pPr>
-      <w:r>
-        <w:t>FAQ-AUTO-0089</w:t>
-      </w:r>
-    </w:p>
-    <w:p>
-      <w:pPr>
-        <w:pStyle w:val="ListBullet"/>
-      </w:pPr>
-      <w:r>
-        <w:t>FAQ-AUTO-0090</w:t>
-      </w:r>
-    </w:p>
-    <w:p>
-      <w:pPr>
-        <w:pStyle w:val="ListBullet"/>
-      </w:pPr>
-      <w:r>
-        <w:t>DIALOGUE-AUTO-0030</w:t>
-      </w:r>
-    </w:p>
-    <w:p>
-      <w:pPr>
-        <w:pStyle w:val="Heading2"/>
-      </w:pPr>
-      <w:r>
-        <w:t>Referências</w:t>
-      </w:r>
-    </w:p>
-    <w:p>
-      <w:pPr>
-        <w:pStyle w:val="ListBullet"/>
-      </w:pPr>
-      <w:r>
-        <w:t>Documento interno: `EDITORIAL_RULES.md`</w:t>
-      </w:r>
-    </w:p>
-    <w:p>
-      <w:pPr>
-        <w:pStyle w:val="Heading2"/>
-      </w:pPr>
-      <w:r>
-        <w:t>Tags</w:t>
-      </w:r>
-    </w:p>
-    <w:p>
-      <w:pPr>
-        <w:pStyle w:val="ListBullet"/>
-      </w:pPr>
-      <w:r>
-        <w:t>case</w:t>
-      </w:r>
-    </w:p>
-    <w:p>
-      <w:pPr>
-        <w:pStyle w:val="ListBullet"/>
-      </w:pPr>
-      <w:r>
-        <w:t>auto</w:t>
-      </w:r>
-    </w:p>
-    <w:p>
-      <w:pPr>
-        <w:pStyle w:val="ListBullet"/>
-      </w:pPr>
-      <w:r>
-        <w:t>atendimento</w:t>
-      </w:r>
-    </w:p>
-    <w:p>
-      <w:pPr>
-        <w:pStyle w:val="ListBullet"/>
-      </w:pPr>
-      <w:r>
-        <w:t>revisao</w:t>
-      </w:r>
-    </w:p>
-    <w:p>
-      <w:pPr>
-        <w:pStyle w:val="Heading2"/>
-      </w:pPr>
-      <w:r>
-        <w:t>Veja também</w:t>
-      </w:r>
-    </w:p>
-    <w:p>
-      <w:pPr>
-        <w:pStyle w:val="ListBullet"/>
-      </w:pPr>
-      <w:r>
-        <w:t>`14_FAQ/AUTO/FAQ-AUTO-0089.md`</w:t>
-      </w:r>
-    </w:p>
-    <w:p>
-      <w:pPr>
-        <w:pStyle w:val="Heading2"/>
-      </w:pPr>
-      <w:r>
-        <w:t>Histórico de revisão</w:t>
-      </w:r>
-    </w:p>
-    <w:p>
-      <w:r>
-        <w:t>| Data | Versão | Autor | Alteração |</w:t>
-      </w:r>
-    </w:p>
-    <w:p>
-      <w:r>
-        <w:t>| --- | --- | --- | --- |</w:t>
-      </w:r>
-    </w:p>
-    <w:p>
-      <w:r>
-        <w:t>| 2026-06-25 | 0.1 | JP-BR Insurance Knowledge Base | Criação inicial. |</w:t>
-      </w:r>
-    </w:p>
-    <w:p>
-      <w:r>
-        <w:t>————————————————————————</w:t>
-      </w:r>
-    </w:p>
-    <w:p>
-      <w:pPr>
-        <w:pStyle w:val="Heading1"/>
-      </w:pPr>
-      <w:r>
-        <w:t>CASE-AUTO-0042 - Cliente mudou endereço, contato ou titularidade</w:t>
-      </w:r>
-    </w:p>
-    <w:p>
-      <w:pPr>
-        <w:pStyle w:val="Heading2"/>
-      </w:pPr>
-      <w:r>
-        <w:t>Controle</w:t>
-      </w:r>
-    </w:p>
-    <w:p>
-      <w:pPr>
-        <w:pStyle w:val="ListBullet"/>
-      </w:pPr>
-      <w:r>
-        <w:t>Versão: 0.1</w:t>
-      </w:r>
-    </w:p>
-    <w:p>
-      <w:pPr>
-        <w:pStyle w:val="ListBullet"/>
-      </w:pPr>
-      <w:r>
-        <w:t>Data: 2026-06-25</w:t>
-      </w:r>
-    </w:p>
-    <w:p>
-      <w:pPr>
-        <w:pStyle w:val="ListBullet"/>
-      </w:pPr>
-      <w:r>
-        <w:t>Autor: JP-BR Insurance Knowledge Base</w:t>
-      </w:r>
-    </w:p>
-    <w:p>
-      <w:pPr>
-        <w:pStyle w:val="ListBullet"/>
-      </w:pPr>
-      <w:r>
-        <w:t>Histórico: Criação inicial.</w:t>
-      </w:r>
-    </w:p>
-    <w:p>
-      <w:pPr>
-        <w:pStyle w:val="Heading2"/>
-      </w:pPr>
-      <w:r>
-        <w:t>Código</w:t>
-      </w:r>
-    </w:p>
-    <w:p>
-      <w:r>
-        <w:t>CASE-AUTO-0042</w:t>
-      </w:r>
-    </w:p>
-    <w:p>
-      <w:pPr>
-        <w:pStyle w:val="Heading2"/>
-      </w:pPr>
-      <w:r>
-        <w:t>Produto ou categoria</w:t>
-      </w:r>
-    </w:p>
-    <w:p>
-      <w:r>
-        <w:t>AUTO</w:t>
-      </w:r>
-    </w:p>
-    <w:p>
-      <w:pPr>
-        <w:pStyle w:val="Heading2"/>
-      </w:pPr>
-      <w:r>
-        <w:t>Situação</w:t>
-      </w:r>
-    </w:p>
-    <w:p>
-      <w:r>
-        <w:t>Cliente mudou endereço, contato ou titularidade.</w:t>
-      </w:r>
-    </w:p>
-    <w:p>
-      <w:pPr>
-        <w:pStyle w:val="Heading2"/>
-      </w:pPr>
-      <w:r>
-        <w:t>Problema</w:t>
-      </w:r>
-    </w:p>
-    <w:p>
-      <w:r>
-        <w:t>Cliente pode manter contrato desatualizado, interpretar resumo como contrato completo ou perder prazo importante por falta de acompanhamento.</w:t>
-      </w:r>
-    </w:p>
-    <w:p>
-      <w:pPr>
-        <w:pStyle w:val="Heading2"/>
-      </w:pPr>
-      <w:r>
-        <w:t>Análise</w:t>
-      </w:r>
-    </w:p>
-    <w:p>
-      <w:r>
-        <w:t>Atendimento recorrente, conferência de dados, revisão de cobertura e controle de vencimento reduzem riscos comerciais e operacionais.</w:t>
-      </w:r>
-    </w:p>
-    <w:p>
-      <w:pPr>
-        <w:pStyle w:val="Heading2"/>
-      </w:pPr>
-      <w:r>
-        <w:t>Orientação ao corretor</w:t>
-      </w:r>
-    </w:p>
-    <w:p>
-      <w:r>
-        <w:t>Revisar dados e coberturas com método, registrar mudanças e orientar o cliente antes de vencimento, cancelamento ou sinistro.</w:t>
-      </w:r>
-    </w:p>
-    <w:p>
-      <w:pPr>
-        <w:pStyle w:val="Heading2"/>
-      </w:pPr>
-      <w:r>
-        <w:t>Como explicar ao cliente brasileiro</w:t>
-      </w:r>
-    </w:p>
-    <w:p>
-      <w:r>
-        <w:t>Vamos manter seu seguro atualizado para evitar surpresa quando você precisar usar ou renovar.</w:t>
-      </w:r>
-    </w:p>
-    <w:p>
-      <w:pPr>
-        <w:pStyle w:val="Heading2"/>
-      </w:pPr>
-      <w:r>
-        <w:t>Resultado esperado</w:t>
-      </w:r>
-    </w:p>
-    <w:p>
-      <w:r>
-        <w:t>Cliente mantém contrato correto, entende o processo e recebe acompanhamento profissional depois da venda.</w:t>
-      </w:r>
-    </w:p>
-    <w:p>
-      <w:pPr>
-        <w:pStyle w:val="Heading2"/>
-      </w:pPr>
-      <w:r>
-        <w:t>Termos relacionados</w:t>
-      </w:r>
-    </w:p>
-    <w:p>
-      <w:pPr>
-        <w:pStyle w:val="ListBullet"/>
-      </w:pPr>
-      <w:r>
-        <w:t>AUTO-0094 - 住所変更 - Alteração de endereço</w:t>
-      </w:r>
-    </w:p>
-    <w:p>
-      <w:pPr>
-        <w:pStyle w:val="ListBullet"/>
-      </w:pPr>
-      <w:r>
-        <w:t>AUTO-0095 - 連絡先変更 - Alteração de contato</w:t>
-      </w:r>
-    </w:p>
-    <w:p>
-      <w:pPr>
-        <w:pStyle w:val="ListBullet"/>
-      </w:pPr>
-      <w:r>
-        <w:t>AUTO-0096 - 名義変更 - Alteração de titularidade</w:t>
-      </w:r>
-    </w:p>
-    <w:p>
-      <w:pPr>
-        <w:pStyle w:val="Heading2"/>
-      </w:pPr>
-      <w:r>
-        <w:t>FAQs relacionadas</w:t>
-      </w:r>
-    </w:p>
-    <w:p>
-      <w:pPr>
-        <w:pStyle w:val="ListBullet"/>
-      </w:pPr>
-      <w:r>
-        <w:t>FAQ-AUTO-0091</w:t>
-      </w:r>
-    </w:p>
-    <w:p>
-      <w:pPr>
-        <w:pStyle w:val="ListBullet"/>
-      </w:pPr>
-      <w:r>
-        <w:t>FAQ-AUTO-0092</w:t>
-      </w:r>
-    </w:p>
-    <w:p>
-      <w:pPr>
-        <w:pStyle w:val="ListBullet"/>
-      </w:pPr>
-      <w:r>
-        <w:t>FAQ-AUTO-0093</w:t>
-      </w:r>
-    </w:p>
-    <w:p>
-      <w:pPr>
-        <w:pStyle w:val="Heading2"/>
-      </w:pPr>
-      <w:r>
-        <w:t>Diálogos relacionados</w:t>
-      </w:r>
-    </w:p>
-    <w:p>
-      <w:pPr>
-        <w:pStyle w:val="ListBullet"/>
-      </w:pPr>
-      <w:r>
-        <w:t>DIALOGUE-AUTO-0031</w:t>
-      </w:r>
-    </w:p>
-    <w:p>
-      <w:pPr>
-        <w:pStyle w:val="Heading2"/>
-      </w:pPr>
-      <w:r>
-        <w:t>Referências cruzadas</w:t>
-      </w:r>
-    </w:p>
-    <w:p>
-      <w:pPr>
-        <w:pStyle w:val="ListBullet"/>
-      </w:pPr>
-      <w:r>
-        <w:t>AUTO-0094</w:t>
-      </w:r>
-    </w:p>
-    <w:p>
-      <w:pPr>
-        <w:pStyle w:val="ListBullet"/>
-      </w:pPr>
-      <w:r>
-        <w:t>AUTO-0095</w:t>
-      </w:r>
-    </w:p>
-    <w:p>
-      <w:pPr>
-        <w:pStyle w:val="ListBullet"/>
-      </w:pPr>
-      <w:r>
-        <w:t>AUTO-0096</w:t>
-      </w:r>
-    </w:p>
-    <w:p>
-      <w:pPr>
-        <w:pStyle w:val="ListBullet"/>
-      </w:pPr>
-      <w:r>
-        <w:t>FAQ-AUTO-0091</w:t>
-      </w:r>
-    </w:p>
-    <w:p>
-      <w:pPr>
-        <w:pStyle w:val="ListBullet"/>
-      </w:pPr>
-      <w:r>
-        <w:t>FAQ-AUTO-0092</w:t>
-      </w:r>
-    </w:p>
-    <w:p>
-      <w:pPr>
-        <w:pStyle w:val="ListBullet"/>
-      </w:pPr>
-      <w:r>
-        <w:t>FAQ-AUTO-0093</w:t>
-      </w:r>
-    </w:p>
-    <w:p>
-      <w:pPr>
-        <w:pStyle w:val="ListBullet"/>
-      </w:pPr>
-      <w:r>
-        <w:t>DIALOGUE-AUTO-0031</w:t>
-      </w:r>
-    </w:p>
-    <w:p>
-      <w:pPr>
-        <w:pStyle w:val="Heading2"/>
-      </w:pPr>
-      <w:r>
-        <w:t>Referências</w:t>
-      </w:r>
-    </w:p>
-    <w:p>
-      <w:pPr>
-        <w:pStyle w:val="ListBullet"/>
-      </w:pPr>
-      <w:r>
-        <w:t>Documento interno: `EDITORIAL_RULES.md`</w:t>
-      </w:r>
-    </w:p>
-    <w:p>
-      <w:pPr>
-        <w:pStyle w:val="Heading2"/>
-      </w:pPr>
-      <w:r>
-        <w:t>Tags</w:t>
-      </w:r>
-    </w:p>
-    <w:p>
-      <w:pPr>
-        <w:pStyle w:val="ListBullet"/>
-      </w:pPr>
-      <w:r>
-        <w:t>case</w:t>
-      </w:r>
-    </w:p>
-    <w:p>
-      <w:pPr>
-        <w:pStyle w:val="ListBullet"/>
-      </w:pPr>
-      <w:r>
-        <w:t>auto</w:t>
-      </w:r>
-    </w:p>
-    <w:p>
-      <w:pPr>
-        <w:pStyle w:val="ListBullet"/>
-      </w:pPr>
-      <w:r>
-        <w:t>atendimento</w:t>
-      </w:r>
-    </w:p>
-    <w:p>
-      <w:pPr>
-        <w:pStyle w:val="ListBullet"/>
-      </w:pPr>
-      <w:r>
-        <w:t>revisao</w:t>
-      </w:r>
-    </w:p>
-    <w:p>
-      <w:pPr>
-        <w:pStyle w:val="Heading2"/>
-      </w:pPr>
-      <w:r>
-        <w:t>Veja também</w:t>
-      </w:r>
-    </w:p>
-    <w:p>
-      <w:pPr>
-        <w:pStyle w:val="ListBullet"/>
-      </w:pPr>
-      <w:r>
-        <w:t>`14_FAQ/AUTO/FAQ-AUTO-0091.md`</w:t>
-      </w:r>
-    </w:p>
-    <w:p>
-      <w:pPr>
-        <w:pStyle w:val="Heading2"/>
-      </w:pPr>
-      <w:r>
-        <w:t>Histórico de revisão</w:t>
-      </w:r>
-    </w:p>
-    <w:p>
-      <w:r>
-        <w:t>| Data | Versão | Autor | Alteração |</w:t>
-      </w:r>
-    </w:p>
-    <w:p>
-      <w:r>
-        <w:t>| --- | --- | --- | --- |</w:t>
-      </w:r>
-    </w:p>
-    <w:p>
-      <w:r>
-        <w:t>| 2026-06-25 | 0.1 | JP-BR Insurance Knowledge Base | Criação inicial. |</w:t>
-      </w:r>
-    </w:p>
-    <w:p>
-      <w:r>
-        <w:t>————————————————————————</w:t>
-      </w:r>
-    </w:p>
-    <w:p>
-      <w:pPr>
-        <w:pStyle w:val="Heading1"/>
-      </w:pPr>
-      <w:r>
-        <w:t>CASE-AUTO-0043 - Cliente quer cancelar perto da renovação</w:t>
-      </w:r>
-    </w:p>
-    <w:p>
-      <w:pPr>
-        <w:pStyle w:val="Heading2"/>
-      </w:pPr>
-      <w:r>
-        <w:t>Controle</w:t>
-      </w:r>
-    </w:p>
-    <w:p>
-      <w:pPr>
-        <w:pStyle w:val="ListBullet"/>
-      </w:pPr>
-      <w:r>
-        <w:t>Versão: 0.1</w:t>
-      </w:r>
-    </w:p>
-    <w:p>
-      <w:pPr>
-        <w:pStyle w:val="ListBullet"/>
-      </w:pPr>
-      <w:r>
-        <w:t>Data: 2026-06-25</w:t>
-      </w:r>
-    </w:p>
-    <w:p>
-      <w:pPr>
-        <w:pStyle w:val="ListBullet"/>
-      </w:pPr>
-      <w:r>
-        <w:t>Autor: JP-BR Insurance Knowledge Base</w:t>
-      </w:r>
-    </w:p>
-    <w:p>
-      <w:pPr>
-        <w:pStyle w:val="ListBullet"/>
-      </w:pPr>
-      <w:r>
-        <w:t>Histórico: Criação inicial.</w:t>
-      </w:r>
-    </w:p>
-    <w:p>
-      <w:pPr>
-        <w:pStyle w:val="Heading2"/>
-      </w:pPr>
-      <w:r>
-        <w:t>Código</w:t>
-      </w:r>
-    </w:p>
-    <w:p>
-      <w:r>
-        <w:t>CASE-AUTO-0043</w:t>
-      </w:r>
-    </w:p>
-    <w:p>
-      <w:pPr>
-        <w:pStyle w:val="Heading2"/>
-      </w:pPr>
-      <w:r>
-        <w:t>Produto ou categoria</w:t>
-      </w:r>
-    </w:p>
-    <w:p>
-      <w:r>
-        <w:t>AUTO</w:t>
-      </w:r>
-    </w:p>
-    <w:p>
-      <w:pPr>
-        <w:pStyle w:val="Heading2"/>
-      </w:pPr>
-      <w:r>
-        <w:t>Situação</w:t>
-      </w:r>
-    </w:p>
-    <w:p>
-      <w:r>
-        <w:t>Cliente quer cancelar perto da renovação.</w:t>
-      </w:r>
-    </w:p>
-    <w:p>
-      <w:pPr>
-        <w:pStyle w:val="Heading2"/>
-      </w:pPr>
-      <w:r>
-        <w:t>Problema</w:t>
-      </w:r>
-    </w:p>
-    <w:p>
-      <w:r>
-        <w:t>Cliente pode manter contrato desatualizado, interpretar resumo como contrato completo ou perder prazo importante por falta de acompanhamento.</w:t>
-      </w:r>
-    </w:p>
-    <w:p>
-      <w:pPr>
-        <w:pStyle w:val="Heading2"/>
-      </w:pPr>
-      <w:r>
-        <w:t>Análise</w:t>
-      </w:r>
-    </w:p>
-    <w:p>
-      <w:r>
-        <w:t>Atendimento recorrente, conferência de dados, revisão de cobertura e controle de vencimento reduzem riscos comerciais e operacionais.</w:t>
-      </w:r>
-    </w:p>
-    <w:p>
-      <w:pPr>
-        <w:pStyle w:val="Heading2"/>
-      </w:pPr>
-      <w:r>
-        <w:t>Orientação ao corretor</w:t>
-      </w:r>
-    </w:p>
-    <w:p>
-      <w:r>
-        <w:t>Revisar dados e coberturas com método, registrar mudanças e orientar o cliente antes de vencimento, cancelamento ou sinistro.</w:t>
-      </w:r>
-    </w:p>
-    <w:p>
-      <w:pPr>
-        <w:pStyle w:val="Heading2"/>
-      </w:pPr>
-      <w:r>
-        <w:t>Como explicar ao cliente brasileiro</w:t>
-      </w:r>
-    </w:p>
-    <w:p>
-      <w:r>
-        <w:t>Vamos manter seu seguro atualizado para evitar surpresa quando você precisar usar ou renovar.</w:t>
-      </w:r>
-    </w:p>
-    <w:p>
-      <w:pPr>
-        <w:pStyle w:val="Heading2"/>
-      </w:pPr>
-      <w:r>
-        <w:t>Resultado esperado</w:t>
-      </w:r>
-    </w:p>
-    <w:p>
-      <w:r>
-        <w:t>Cliente mantém contrato correto, entende o processo e recebe acompanhamento profissional depois da venda.</w:t>
-      </w:r>
-    </w:p>
-    <w:p>
-      <w:pPr>
-        <w:pStyle w:val="Heading2"/>
-      </w:pPr>
-      <w:r>
-        <w:t>Termos relacionados</w:t>
-      </w:r>
-    </w:p>
-    <w:p>
-      <w:pPr>
-        <w:pStyle w:val="ListBullet"/>
-      </w:pPr>
-      <w:r>
-        <w:t>AUTO-0097 - 解約手続き - Procedimento de cancelamento</w:t>
-      </w:r>
-    </w:p>
-    <w:p>
-      <w:pPr>
-        <w:pStyle w:val="ListBullet"/>
-      </w:pPr>
-      <w:r>
-        <w:t>AUTO-0098 - 更新案内 - Aviso de renovação</w:t>
-      </w:r>
-    </w:p>
-    <w:p>
-      <w:pPr>
-        <w:pStyle w:val="ListBullet"/>
-      </w:pPr>
-      <w:r>
-        <w:t>AUTO-0099 - 満期管理 - Controle de vencimento</w:t>
-      </w:r>
-    </w:p>
-    <w:p>
-      <w:pPr>
-        <w:pStyle w:val="Heading2"/>
-      </w:pPr>
-      <w:r>
-        <w:t>FAQs relacionadas</w:t>
-      </w:r>
-    </w:p>
-    <w:p>
-      <w:pPr>
-        <w:pStyle w:val="ListBullet"/>
-      </w:pPr>
-      <w:r>
-        <w:t>FAQ-AUTO-0094</w:t>
-      </w:r>
-    </w:p>
-    <w:p>
-      <w:pPr>
-        <w:pStyle w:val="ListBullet"/>
-      </w:pPr>
-      <w:r>
-        <w:t>FAQ-AUTO-0095</w:t>
-      </w:r>
-    </w:p>
-    <w:p>
-      <w:pPr>
-        <w:pStyle w:val="ListBullet"/>
-      </w:pPr>
-      <w:r>
-        <w:t>FAQ-AUTO-0096</w:t>
-      </w:r>
-    </w:p>
-    <w:p>
-      <w:pPr>
-        <w:pStyle w:val="Heading2"/>
-      </w:pPr>
-      <w:r>
-        <w:t>Diálogos relacionados</w:t>
-      </w:r>
-    </w:p>
-    <w:p>
-      <w:pPr>
-        <w:pStyle w:val="ListBullet"/>
-      </w:pPr>
-      <w:r>
-        <w:t>DIALOGUE-AUTO-0032</w:t>
-      </w:r>
-    </w:p>
-    <w:p>
-      <w:pPr>
-        <w:pStyle w:val="Heading2"/>
-      </w:pPr>
-      <w:r>
-        <w:t>Referências cruzadas</w:t>
-      </w:r>
-    </w:p>
-    <w:p>
-      <w:pPr>
-        <w:pStyle w:val="ListBullet"/>
-      </w:pPr>
-      <w:r>
-        <w:t>AUTO-0097</w:t>
-      </w:r>
-    </w:p>
-    <w:p>
-      <w:pPr>
-        <w:pStyle w:val="ListBullet"/>
-      </w:pPr>
-      <w:r>
-        <w:t>AUTO-0098</w:t>
-      </w:r>
-    </w:p>
-    <w:p>
-      <w:pPr>
-        <w:pStyle w:val="ListBullet"/>
-      </w:pPr>
-      <w:r>
-        <w:t>AUTO-0099</w:t>
-      </w:r>
-    </w:p>
-    <w:p>
-      <w:pPr>
-        <w:pStyle w:val="ListBullet"/>
-      </w:pPr>
-      <w:r>
-        <w:t>FAQ-AUTO-0094</w:t>
-      </w:r>
-    </w:p>
-    <w:p>
-      <w:pPr>
-        <w:pStyle w:val="ListBullet"/>
-      </w:pPr>
-      <w:r>
-        <w:t>FAQ-AUTO-0095</w:t>
-      </w:r>
-    </w:p>
-    <w:p>
-      <w:pPr>
-        <w:pStyle w:val="ListBullet"/>
-      </w:pPr>
-      <w:r>
-        <w:t>FAQ-AUTO-0096</w:t>
-      </w:r>
-    </w:p>
-    <w:p>
-      <w:pPr>
-        <w:pStyle w:val="ListBullet"/>
-      </w:pPr>
-      <w:r>
-        <w:t>DIALOGUE-AUTO-0032</w:t>
-      </w:r>
-    </w:p>
-    <w:p>
-      <w:pPr>
-        <w:pStyle w:val="Heading2"/>
-      </w:pPr>
-      <w:r>
-        <w:t>Referências</w:t>
-      </w:r>
-    </w:p>
-    <w:p>
-      <w:pPr>
-        <w:pStyle w:val="ListBullet"/>
-      </w:pPr>
-      <w:r>
-        <w:t>Documento interno: `EDITORIAL_RULES.md`</w:t>
-      </w:r>
-    </w:p>
-    <w:p>
-      <w:pPr>
-        <w:pStyle w:val="Heading2"/>
-      </w:pPr>
-      <w:r>
-        <w:t>Tags</w:t>
-      </w:r>
-    </w:p>
-    <w:p>
-      <w:pPr>
-        <w:pStyle w:val="ListBullet"/>
-      </w:pPr>
-      <w:r>
-        <w:t>case</w:t>
-      </w:r>
-    </w:p>
-    <w:p>
-      <w:pPr>
-        <w:pStyle w:val="ListBullet"/>
-      </w:pPr>
-      <w:r>
-        <w:t>auto</w:t>
-      </w:r>
-    </w:p>
-    <w:p>
-      <w:pPr>
-        <w:pStyle w:val="ListBullet"/>
-      </w:pPr>
-      <w:r>
-        <w:t>atendimento</w:t>
-      </w:r>
-    </w:p>
-    <w:p>
-      <w:pPr>
-        <w:pStyle w:val="ListBullet"/>
-      </w:pPr>
-      <w:r>
-        <w:t>revisao</w:t>
-      </w:r>
-    </w:p>
-    <w:p>
-      <w:pPr>
-        <w:pStyle w:val="Heading2"/>
-      </w:pPr>
-      <w:r>
-        <w:t>Veja também</w:t>
-      </w:r>
-    </w:p>
-    <w:p>
-      <w:pPr>
-        <w:pStyle w:val="ListBullet"/>
-      </w:pPr>
-      <w:r>
-        <w:t>`14_FAQ/AUTO/FAQ-AUTO-0094.md`</w:t>
-      </w:r>
-    </w:p>
-    <w:p>
-      <w:pPr>
-        <w:pStyle w:val="Heading2"/>
-      </w:pPr>
-      <w:r>
-        <w:t>Histórico de revisão</w:t>
-      </w:r>
-    </w:p>
-    <w:p>
-      <w:r>
-        <w:t>| Data | Versão | Autor | Alteração |</w:t>
-      </w:r>
-    </w:p>
-    <w:p>
-      <w:r>
-        <w:t>| --- | --- | --- | --- |</w:t>
-      </w:r>
-    </w:p>
-    <w:p>
-      <w:r>
-        <w:t>| 2026-06-25 | 0.1 | JP-BR Insurance Knowledge Base | Criação inicial. |</w:t>
-      </w:r>
-    </w:p>
-    <w:p>
-      <w:r>
-        <w:t>————————————————————————</w:t>
-      </w:r>
-    </w:p>
-    <w:p>
-      <w:pPr>
-        <w:pStyle w:val="Heading1"/>
-      </w:pPr>
-      <w:r>
-        <w:t>CASE-AUTO-0044 - Pós-venda evita vencimento e problemas futuros</w:t>
-      </w:r>
-    </w:p>
-    <w:p>
-      <w:pPr>
-        <w:pStyle w:val="Heading2"/>
-      </w:pPr>
-      <w:r>
-        <w:t>Controle</w:t>
-      </w:r>
-    </w:p>
-    <w:p>
-      <w:pPr>
-        <w:pStyle w:val="ListBullet"/>
-      </w:pPr>
-      <w:r>
-        <w:t>Versão: 0.1</w:t>
-      </w:r>
-    </w:p>
-    <w:p>
-      <w:pPr>
-        <w:pStyle w:val="ListBullet"/>
-      </w:pPr>
-      <w:r>
-        <w:t>Data: 2026-06-25</w:t>
-      </w:r>
-    </w:p>
-    <w:p>
-      <w:pPr>
-        <w:pStyle w:val="ListBullet"/>
-      </w:pPr>
-      <w:r>
-        <w:t>Autor: JP-BR Insurance Knowledge Base</w:t>
-      </w:r>
-    </w:p>
-    <w:p>
-      <w:pPr>
-        <w:pStyle w:val="ListBullet"/>
-      </w:pPr>
-      <w:r>
-        <w:t>Histórico: Criação inicial.</w:t>
-      </w:r>
-    </w:p>
-    <w:p>
-      <w:pPr>
-        <w:pStyle w:val="Heading2"/>
-      </w:pPr>
-      <w:r>
-        <w:t>Código</w:t>
-      </w:r>
-    </w:p>
-    <w:p>
-      <w:r>
-        <w:t>CASE-AUTO-0044</w:t>
-      </w:r>
-    </w:p>
-    <w:p>
-      <w:pPr>
-        <w:pStyle w:val="Heading2"/>
-      </w:pPr>
-      <w:r>
-        <w:t>Produto ou categoria</w:t>
-      </w:r>
-    </w:p>
-    <w:p>
-      <w:r>
-        <w:t>AUTO</w:t>
-      </w:r>
-    </w:p>
-    <w:p>
-      <w:pPr>
-        <w:pStyle w:val="Heading2"/>
-      </w:pPr>
-      <w:r>
-        <w:t>Situação</w:t>
-      </w:r>
-    </w:p>
-    <w:p>
-      <w:r>
-        <w:t>Pós-venda evita vencimento e problemas futuros.</w:t>
-      </w:r>
-    </w:p>
-    <w:p>
-      <w:pPr>
-        <w:pStyle w:val="Heading2"/>
-      </w:pPr>
-      <w:r>
-        <w:t>Problema</w:t>
-      </w:r>
-    </w:p>
-    <w:p>
-      <w:r>
-        <w:t>Cliente pode manter contrato desatualizado, interpretar resumo como contrato completo ou perder prazo importante por falta de acompanhamento.</w:t>
-      </w:r>
-    </w:p>
-    <w:p>
-      <w:pPr>
-        <w:pStyle w:val="Heading2"/>
-      </w:pPr>
-      <w:r>
-        <w:t>Análise</w:t>
-      </w:r>
-    </w:p>
-    <w:p>
-      <w:r>
-        <w:t>Atendimento recorrente, conferência de dados, revisão de cobertura e controle de vencimento reduzem riscos comerciais e operacionais.</w:t>
-      </w:r>
-    </w:p>
-    <w:p>
-      <w:pPr>
-        <w:pStyle w:val="Heading2"/>
-      </w:pPr>
-      <w:r>
-        <w:t>Orientação ao corretor</w:t>
-      </w:r>
-    </w:p>
-    <w:p>
-      <w:r>
-        <w:t>Revisar dados e coberturas com método, registrar mudanças e orientar o cliente antes de vencimento, cancelamento ou sinistro.</w:t>
-      </w:r>
-    </w:p>
-    <w:p>
-      <w:pPr>
-        <w:pStyle w:val="Heading2"/>
-      </w:pPr>
-      <w:r>
-        <w:t>Como explicar ao cliente brasileiro</w:t>
-      </w:r>
-    </w:p>
-    <w:p>
-      <w:r>
-        <w:t>Vamos manter seu seguro atualizado para evitar surpresa quando você precisar usar ou renovar.</w:t>
-      </w:r>
-    </w:p>
-    <w:p>
-      <w:pPr>
-        <w:pStyle w:val="Heading2"/>
-      </w:pPr>
-      <w:r>
-        <w:t>Resultado esperado</w:t>
-      </w:r>
-    </w:p>
-    <w:p>
-      <w:r>
-        <w:t>Cliente mantém contrato correto, entende o processo e recebe acompanhamento profissional depois da venda.</w:t>
-      </w:r>
-    </w:p>
-    <w:p>
-      <w:pPr>
-        <w:pStyle w:val="Heading2"/>
-      </w:pPr>
-      <w:r>
-        <w:t>Termos relacionados</w:t>
-      </w:r>
-    </w:p>
-    <w:p>
-      <w:pPr>
-        <w:pStyle w:val="ListBullet"/>
-      </w:pPr>
-      <w:r>
-        <w:t>AUTO-0098 - 更新案内 - Aviso de renovação</w:t>
-      </w:r>
-    </w:p>
-    <w:p>
-      <w:pPr>
-        <w:pStyle w:val="ListBullet"/>
-      </w:pPr>
-      <w:r>
-        <w:t>AUTO-0099 - 満期管理 - Controle de vencimento</w:t>
-      </w:r>
-    </w:p>
-    <w:p>
-      <w:pPr>
-        <w:pStyle w:val="ListBullet"/>
-      </w:pPr>
-      <w:r>
-        <w:t>AUTO-0100 - アフターサービス - Atendimento pós-venda</w:t>
-      </w:r>
-    </w:p>
-    <w:p>
-      <w:pPr>
-        <w:pStyle w:val="Heading2"/>
-      </w:pPr>
-      <w:r>
-        <w:t>FAQs relacionadas</w:t>
-      </w:r>
-    </w:p>
-    <w:p>
-      <w:pPr>
-        <w:pStyle w:val="ListBullet"/>
-      </w:pPr>
-      <w:r>
-        <w:t>FAQ-AUTO-0095</w:t>
-      </w:r>
-    </w:p>
-    <w:p>
-      <w:pPr>
-        <w:pStyle w:val="ListBullet"/>
-      </w:pPr>
-      <w:r>
-        <w:t>FAQ-AUTO-0096</w:t>
-      </w:r>
-    </w:p>
-    <w:p>
-      <w:pPr>
-        <w:pStyle w:val="ListBullet"/>
-      </w:pPr>
-      <w:r>
-        <w:t>FAQ-AUTO-0097</w:t>
-      </w:r>
-    </w:p>
-    <w:p>
-      <w:pPr>
-        <w:pStyle w:val="Heading2"/>
-      </w:pPr>
-      <w:r>
-        <w:t>Diálogos relacionados</w:t>
-      </w:r>
-    </w:p>
-    <w:p>
-      <w:pPr>
-        <w:pStyle w:val="ListBullet"/>
-      </w:pPr>
-      <w:r>
-        <w:t>DIALOGUE-AUTO-0032</w:t>
-      </w:r>
-    </w:p>
-    <w:p>
-      <w:pPr>
-        <w:pStyle w:val="Heading2"/>
-      </w:pPr>
-      <w:r>
-        <w:t>Referências cruzadas</w:t>
-      </w:r>
-    </w:p>
-    <w:p>
-      <w:pPr>
-        <w:pStyle w:val="ListBullet"/>
-      </w:pPr>
-      <w:r>
-        <w:t>AUTO-0098</w:t>
-      </w:r>
-    </w:p>
-    <w:p>
-      <w:pPr>
-        <w:pStyle w:val="ListBullet"/>
-      </w:pPr>
-      <w:r>
-        <w:t>AUTO-0099</w:t>
-      </w:r>
-    </w:p>
-    <w:p>
-      <w:pPr>
-        <w:pStyle w:val="ListBullet"/>
-      </w:pPr>
-      <w:r>
-        <w:t>AUTO-0100</w:t>
-      </w:r>
-    </w:p>
-    <w:p>
-      <w:pPr>
-        <w:pStyle w:val="ListBullet"/>
-      </w:pPr>
-      <w:r>
-        <w:t>FAQ-AUTO-0095</w:t>
-      </w:r>
-    </w:p>
-    <w:p>
-      <w:pPr>
-        <w:pStyle w:val="ListBullet"/>
-      </w:pPr>
-      <w:r>
-        <w:t>FAQ-AUTO-0096</w:t>
-      </w:r>
-    </w:p>
-    <w:p>
-      <w:pPr>
-        <w:pStyle w:val="ListBullet"/>
-      </w:pPr>
-      <w:r>
-        <w:t>FAQ-AUTO-0097</w:t>
-      </w:r>
-    </w:p>
-    <w:p>
-      <w:pPr>
-        <w:pStyle w:val="ListBullet"/>
-      </w:pPr>
-      <w:r>
-        <w:t>DIALOGUE-AUTO-0032</w:t>
-      </w:r>
-    </w:p>
-    <w:p>
-      <w:pPr>
-        <w:pStyle w:val="Heading2"/>
-      </w:pPr>
-      <w:r>
-        <w:t>Referências</w:t>
-      </w:r>
-    </w:p>
-    <w:p>
-      <w:pPr>
-        <w:pStyle w:val="ListBullet"/>
-      </w:pPr>
-      <w:r>
-        <w:t>Documento interno: `EDITORIAL_RULES.md`</w:t>
-      </w:r>
-    </w:p>
-    <w:p>
-      <w:pPr>
-        <w:pStyle w:val="Heading2"/>
-      </w:pPr>
-      <w:r>
-        <w:t>Tags</w:t>
-      </w:r>
-    </w:p>
-    <w:p>
-      <w:pPr>
-        <w:pStyle w:val="ListBullet"/>
-      </w:pPr>
-      <w:r>
-        <w:t>case</w:t>
-      </w:r>
-    </w:p>
-    <w:p>
-      <w:pPr>
-        <w:pStyle w:val="ListBullet"/>
-      </w:pPr>
-      <w:r>
-        <w:t>auto</w:t>
-      </w:r>
-    </w:p>
-    <w:p>
-      <w:pPr>
-        <w:pStyle w:val="ListBullet"/>
-      </w:pPr>
-      <w:r>
-        <w:t>atendimento</w:t>
-      </w:r>
-    </w:p>
-    <w:p>
-      <w:pPr>
-        <w:pStyle w:val="ListBullet"/>
-      </w:pPr>
-      <w:r>
-        <w:t>revisao</w:t>
-      </w:r>
-    </w:p>
-    <w:p>
-      <w:pPr>
-        <w:pStyle w:val="Heading2"/>
-      </w:pPr>
-      <w:r>
-        <w:t>Veja também</w:t>
-      </w:r>
-    </w:p>
-    <w:p>
-      <w:pPr>
-        <w:pStyle w:val="ListBullet"/>
-      </w:pPr>
-      <w:r>
-        <w:t>`14_FAQ/AUTO/FAQ-AUTO-0095.md`</w:t>
-      </w:r>
-    </w:p>
-    <w:p>
-      <w:pPr>
-        <w:pStyle w:val="Heading2"/>
-      </w:pPr>
-      <w:r>
-        <w:t>Histórico de revisão</w:t>
-      </w:r>
-    </w:p>
-    <w:p>
-      <w:r>
-        <w:t>| Data | Versão | Autor | Alteração |</w:t>
-      </w:r>
-    </w:p>
-    <w:p>
-      <w:r>
-        <w:t>| --- | --- | --- | --- |</w:t>
-      </w:r>
-    </w:p>
-    <w:p>
-      <w:r>
-        <w:t>| 2026-06-25 | 0.1 | JP-BR Insurance Knowledge Base | Criação inicial. |</w:t>
-      </w:r>
-    </w:p>
+    <w:tbl>
+      <w:tblPr>
+        <w:tblStyle w:val="TableGrid"/>
+        <w:tblW w:type="auto" w:w="0"/>
+        <w:tblLook w:firstColumn="1" w:firstRow="1" w:lastColumn="0" w:lastRow="0" w:noHBand="0" w:noVBand="1" w:val="04A0"/>
+      </w:tblPr>
+      <w:tblGrid>
+        <w:gridCol w:w="2448"/>
+        <w:gridCol w:w="2448"/>
+        <w:gridCol w:w="2448"/>
+        <w:gridCol w:w="2448"/>
+      </w:tblGrid>
+      <w:tr>
+        <w:tc>
+          <w:tcPr>
+            <w:tcW w:type="dxa" w:w="2448"/>
+          </w:tcPr>
+          <w:p>
+            <w:r>
+              <w:t>Data</w:t>
+            </w:r>
+          </w:p>
+        </w:tc>
+        <w:tc>
+          <w:tcPr>
+            <w:tcW w:type="dxa" w:w="2448"/>
+          </w:tcPr>
+          <w:p>
+            <w:r>
+              <w:t>Versão</w:t>
+            </w:r>
+          </w:p>
+        </w:tc>
+        <w:tc>
+          <w:tcPr>
+            <w:tcW w:type="dxa" w:w="2448"/>
+          </w:tcPr>
+          <w:p>
+            <w:r>
+              <w:t>Autor</w:t>
+            </w:r>
+          </w:p>
+        </w:tc>
+        <w:tc>
+          <w:tcPr>
+            <w:tcW w:type="dxa" w:w="2448"/>
+          </w:tcPr>
+          <w:p>
+            <w:r>
+              <w:t>Alteração</w:t>
+            </w:r>
+          </w:p>
+        </w:tc>
+      </w:tr>
+      <w:tr>
+        <w:tc>
+          <w:tcPr>
+            <w:tcW w:type="dxa" w:w="2448"/>
+          </w:tcPr>
+          <w:p>
+            <w:r>
+              <w:t>2026-06-25</w:t>
+            </w:r>
+          </w:p>
+        </w:tc>
+        <w:tc>
+          <w:tcPr>
+            <w:tcW w:type="dxa" w:w="2448"/>
+          </w:tcPr>
+          <w:p>
+            <w:r>
+              <w:t>0.1</w:t>
+            </w:r>
+          </w:p>
+        </w:tc>
+        <w:tc>
+          <w:tcPr>
+            <w:tcW w:type="dxa" w:w="2448"/>
+          </w:tcPr>
+          <w:p>
+            <w:r>
+              <w:t>JP-BR Insurance Knowledge Base</w:t>
+            </w:r>
+          </w:p>
+        </w:tc>
+        <w:tc>
+          <w:tcPr>
+            <w:tcW w:type="dxa" w:w="2448"/>
+          </w:tcPr>
+          <w:p>
+            <w:r>
+              <w:t>Criação inicial.</w:t>
+            </w:r>
+          </w:p>
+        </w:tc>
+      </w:tr>
+    </w:tbl>
+    <w:p/>
     <w:sectPr>
       <w:pgSz w:w="12240" w:h="15840"/>
-      <w:pgMar w:top="1440" w:right="1800" w:bottom="1440" w:left="1800" w:header="720" w:footer="720" w:gutter="0"/>
+      <w:pgMar w:top="1152" w:right="1224" w:bottom="1152" w:left="1224" w:header="720" w:footer="720" w:gutter="0"/>
       <w:cols w:space="720"/>
       <w:docGrid w:linePitch="360"/>
     </w:sectPr>
@@ -3520,8 +4271,7 @@
     <w:qFormat/>
     <w:rsid w:val="00FC693F"/>
     <w:rPr>
-      <w:rFonts w:ascii="Arial Unicode MS" w:hAnsi="Arial Unicode MS"/>
-      <w:sz w:val="20"/>
+      <w:rFonts w:ascii="Arial" w:hAnsi="Arial" w:eastAsia="Yu Gothic"/>
     </w:rPr>
   </w:style>
   <w:style w:type="paragraph" w:styleId="Header">
@@ -3538,6 +4288,9 @@
       </w:tabs>
       <w:spacing w:after="0" w:line="240" w:lineRule="auto"/>
     </w:pPr>
+    <w:rPr>
+      <w:rFonts w:ascii="Arial" w:hAnsi="Arial" w:eastAsia="Yu Gothic"/>
+    </w:rPr>
   </w:style>
   <w:style w:type="character" w:customStyle="1" w:styleId="HeaderChar">
     <w:name w:val="Header Char"/>
@@ -3560,6 +4313,9 @@
       </w:tabs>
       <w:spacing w:after="0" w:line="240" w:lineRule="auto"/>
     </w:pPr>
+    <w:rPr>
+      <w:rFonts w:ascii="Arial" w:hAnsi="Arial" w:eastAsia="Yu Gothic"/>
+    </w:rPr>
   </w:style>
   <w:style w:type="character" w:customStyle="1" w:styleId="FooterChar">
     <w:name w:val="Footer Char"/>
@@ -3583,7 +4339,7 @@
       <w:outlineLvl w:val="0"/>
     </w:pPr>
     <w:rPr>
-      <w:rFonts w:asciiTheme="majorHAnsi" w:eastAsiaTheme="majorEastAsia" w:hAnsiTheme="majorHAnsi" w:cstheme="majorBidi"/>
+      <w:rFonts w:asciiTheme="majorHAnsi" w:eastAsiaTheme="majorEastAsia" w:hAnsiTheme="majorHAnsi" w:cstheme="majorBidi" w:ascii="Arial" w:hAnsi="Arial" w:eastAsia="Yu Gothic"/>
       <w:b/>
       <w:bCs/>
       <w:color w:val="365F91" w:themeColor="accent1" w:themeShade="BF"/>
@@ -3607,7 +4363,7 @@
       <w:outlineLvl w:val="1"/>
     </w:pPr>
     <w:rPr>
-      <w:rFonts w:asciiTheme="majorHAnsi" w:eastAsiaTheme="majorEastAsia" w:hAnsiTheme="majorHAnsi" w:cstheme="majorBidi"/>
+      <w:rFonts w:asciiTheme="majorHAnsi" w:eastAsiaTheme="majorEastAsia" w:hAnsiTheme="majorHAnsi" w:cstheme="majorBidi" w:ascii="Arial" w:hAnsi="Arial" w:eastAsia="Yu Gothic"/>
       <w:b/>
       <w:bCs/>
       <w:color w:val="4F81BD" w:themeColor="accent1"/>
@@ -3631,7 +4387,7 @@
       <w:outlineLvl w:val="2"/>
     </w:pPr>
     <w:rPr>
-      <w:rFonts w:asciiTheme="majorHAnsi" w:eastAsiaTheme="majorEastAsia" w:hAnsiTheme="majorHAnsi" w:cstheme="majorBidi"/>
+      <w:rFonts w:asciiTheme="majorHAnsi" w:eastAsiaTheme="majorEastAsia" w:hAnsiTheme="majorHAnsi" w:cstheme="majorBidi" w:ascii="Arial" w:hAnsi="Arial" w:eastAsia="Yu Gothic"/>
       <w:b/>
       <w:bCs/>
       <w:color w:val="4F81BD" w:themeColor="accent1"/>
@@ -3654,7 +4410,7 @@
       <w:outlineLvl w:val="3"/>
     </w:pPr>
     <w:rPr>
-      <w:rFonts w:asciiTheme="majorHAnsi" w:eastAsiaTheme="majorEastAsia" w:hAnsiTheme="majorHAnsi" w:cstheme="majorBidi"/>
+      <w:rFonts w:asciiTheme="majorHAnsi" w:eastAsiaTheme="majorEastAsia" w:hAnsiTheme="majorHAnsi" w:cstheme="majorBidi" w:ascii="Arial" w:hAnsi="Arial" w:eastAsia="Yu Gothic"/>
       <w:b/>
       <w:bCs/>
       <w:i/>
@@ -3679,7 +4435,7 @@
       <w:outlineLvl w:val="4"/>
     </w:pPr>
     <w:rPr>
-      <w:rFonts w:asciiTheme="majorHAnsi" w:eastAsiaTheme="majorEastAsia" w:hAnsiTheme="majorHAnsi" w:cstheme="majorBidi"/>
+      <w:rFonts w:asciiTheme="majorHAnsi" w:eastAsiaTheme="majorEastAsia" w:hAnsiTheme="majorHAnsi" w:cstheme="majorBidi" w:ascii="Arial" w:hAnsi="Arial" w:eastAsia="Yu Gothic"/>
       <w:color w:val="243F60" w:themeColor="accent1" w:themeShade="7F"/>
     </w:rPr>
   </w:style>
@@ -3700,7 +4456,7 @@
       <w:outlineLvl w:val="5"/>
     </w:pPr>
     <w:rPr>
-      <w:rFonts w:asciiTheme="majorHAnsi" w:eastAsiaTheme="majorEastAsia" w:hAnsiTheme="majorHAnsi" w:cstheme="majorBidi"/>
+      <w:rFonts w:asciiTheme="majorHAnsi" w:eastAsiaTheme="majorEastAsia" w:hAnsiTheme="majorHAnsi" w:cstheme="majorBidi" w:ascii="Arial" w:hAnsi="Arial" w:eastAsia="Yu Gothic"/>
       <w:i/>
       <w:iCs/>
       <w:color w:val="243F60" w:themeColor="accent1" w:themeShade="7F"/>
@@ -3723,7 +4479,7 @@
       <w:outlineLvl w:val="6"/>
     </w:pPr>
     <w:rPr>
-      <w:rFonts w:asciiTheme="majorHAnsi" w:eastAsiaTheme="majorEastAsia" w:hAnsiTheme="majorHAnsi" w:cstheme="majorBidi"/>
+      <w:rFonts w:asciiTheme="majorHAnsi" w:eastAsiaTheme="majorEastAsia" w:hAnsiTheme="majorHAnsi" w:cstheme="majorBidi" w:ascii="Arial" w:hAnsi="Arial" w:eastAsia="Yu Gothic"/>
       <w:i/>
       <w:iCs/>
       <w:color w:val="404040" w:themeColor="text1" w:themeTint="BF"/>
@@ -3746,7 +4502,7 @@
       <w:outlineLvl w:val="7"/>
     </w:pPr>
     <w:rPr>
-      <w:rFonts w:asciiTheme="majorHAnsi" w:eastAsiaTheme="majorEastAsia" w:hAnsiTheme="majorHAnsi" w:cstheme="majorBidi"/>
+      <w:rFonts w:asciiTheme="majorHAnsi" w:eastAsiaTheme="majorEastAsia" w:hAnsiTheme="majorHAnsi" w:cstheme="majorBidi" w:ascii="Arial" w:hAnsi="Arial" w:eastAsia="Yu Gothic"/>
       <w:color w:val="4F81BD" w:themeColor="accent1"/>
       <w:sz w:val="20"/>
       <w:szCs w:val="20"/>
@@ -3769,7 +4525,7 @@
       <w:outlineLvl w:val="8"/>
     </w:pPr>
     <w:rPr>
-      <w:rFonts w:asciiTheme="majorHAnsi" w:eastAsiaTheme="majorEastAsia" w:hAnsiTheme="majorHAnsi" w:cstheme="majorBidi"/>
+      <w:rFonts w:asciiTheme="majorHAnsi" w:eastAsiaTheme="majorEastAsia" w:hAnsiTheme="majorHAnsi" w:cstheme="majorBidi" w:ascii="Arial" w:hAnsi="Arial" w:eastAsia="Yu Gothic"/>
       <w:i/>
       <w:iCs/>
       <w:color w:val="404040" w:themeColor="text1" w:themeTint="BF"/>
@@ -3812,6 +4568,9 @@
     <w:pPr>
       <w:spacing w:after="0" w:line="240" w:lineRule="auto"/>
     </w:pPr>
+    <w:rPr>
+      <w:rFonts w:ascii="Arial" w:hAnsi="Arial" w:eastAsia="Yu Gothic"/>
+    </w:rPr>
   </w:style>
   <w:style w:type="character" w:customStyle="1" w:styleId="Heading1Char">
     <w:name w:val="Heading 1 Char"/>
@@ -3872,7 +4631,7 @@
       <w:contextualSpacing/>
     </w:pPr>
     <w:rPr>
-      <w:rFonts w:asciiTheme="majorHAnsi" w:eastAsiaTheme="majorEastAsia" w:hAnsiTheme="majorHAnsi" w:cstheme="majorBidi"/>
+      <w:rFonts w:asciiTheme="majorHAnsi" w:eastAsiaTheme="majorEastAsia" w:hAnsiTheme="majorHAnsi" w:cstheme="majorBidi" w:ascii="Arial" w:hAnsi="Arial" w:eastAsia="Yu Gothic"/>
       <w:color w:val="17365D" w:themeColor="text2" w:themeShade="BF"/>
       <w:spacing w:val="5"/>
       <w:kern w:val="28"/>
@@ -3909,7 +4668,7 @@
       </w:numPr>
     </w:pPr>
     <w:rPr>
-      <w:rFonts w:asciiTheme="majorHAnsi" w:eastAsiaTheme="majorEastAsia" w:hAnsiTheme="majorHAnsi" w:cstheme="majorBidi"/>
+      <w:rFonts w:asciiTheme="majorHAnsi" w:eastAsiaTheme="majorEastAsia" w:hAnsiTheme="majorHAnsi" w:cstheme="majorBidi" w:ascii="Arial" w:hAnsi="Arial" w:eastAsia="Yu Gothic"/>
       <w:i/>
       <w:iCs/>
       <w:color w:val="4F81BD" w:themeColor="accent1"/>
@@ -3944,6 +4703,9 @@
       <w:ind w:left="720"/>
       <w:contextualSpacing/>
     </w:pPr>
+    <w:rPr>
+      <w:rFonts w:ascii="Arial" w:hAnsi="Arial" w:eastAsia="Yu Gothic"/>
+    </w:rPr>
   </w:style>
   <w:style w:type="paragraph" w:styleId="BodyText">
     <w:name w:val="Body Text"/>
@@ -3955,6 +4717,9 @@
     <w:pPr>
       <w:spacing w:after="120"/>
     </w:pPr>
+    <w:rPr>
+      <w:rFonts w:ascii="Arial" w:hAnsi="Arial" w:eastAsia="Yu Gothic"/>
+    </w:rPr>
   </w:style>
   <w:style w:type="character" w:customStyle="1" w:styleId="BodyTextChar">
     <w:name w:val="Body Text Char"/>
@@ -3973,6 +4738,9 @@
     <w:pPr>
       <w:spacing w:after="120" w:line="480" w:lineRule="auto"/>
     </w:pPr>
+    <w:rPr>
+      <w:rFonts w:ascii="Arial" w:hAnsi="Arial" w:eastAsia="Yu Gothic"/>
+    </w:rPr>
   </w:style>
   <w:style w:type="character" w:customStyle="1" w:styleId="BodyText2Char">
     <w:name w:val="Body Text 2 Char"/>
@@ -3992,6 +4760,7 @@
       <w:spacing w:after="120"/>
     </w:pPr>
     <w:rPr>
+      <w:rFonts w:ascii="Arial" w:hAnsi="Arial" w:eastAsia="Yu Gothic"/>
       <w:sz w:val="16"/>
       <w:szCs w:val="16"/>
     </w:rPr>
@@ -4017,6 +4786,9 @@
       <w:ind w:left="360" w:hanging="360"/>
       <w:contextualSpacing/>
     </w:pPr>
+    <w:rPr>
+      <w:rFonts w:ascii="Arial" w:hAnsi="Arial" w:eastAsia="Yu Gothic"/>
+    </w:rPr>
   </w:style>
   <w:style w:type="paragraph" w:styleId="List2">
     <w:name w:val="List 2"/>
@@ -4028,6 +4800,9 @@
       <w:ind w:left="720" w:hanging="360"/>
       <w:contextualSpacing/>
     </w:pPr>
+    <w:rPr>
+      <w:rFonts w:ascii="Arial" w:hAnsi="Arial" w:eastAsia="Yu Gothic"/>
+    </w:rPr>
   </w:style>
   <w:style w:type="paragraph" w:styleId="List3">
     <w:name w:val="List 3"/>
@@ -4039,6 +4814,9 @@
       <w:ind w:left="1080" w:hanging="360"/>
       <w:contextualSpacing/>
     </w:pPr>
+    <w:rPr>
+      <w:rFonts w:ascii="Arial" w:hAnsi="Arial" w:eastAsia="Yu Gothic"/>
+    </w:rPr>
   </w:style>
   <w:style w:type="paragraph" w:styleId="ListBullet">
     <w:name w:val="List Bullet"/>
@@ -4052,6 +4830,9 @@
       </w:numPr>
       <w:contextualSpacing/>
     </w:pPr>
+    <w:rPr>
+      <w:rFonts w:ascii="Arial" w:hAnsi="Arial" w:eastAsia="Yu Gothic"/>
+    </w:rPr>
   </w:style>
   <w:style w:type="paragraph" w:styleId="ListBullet2">
     <w:name w:val="List Bullet 2"/>
@@ -4065,6 +4846,9 @@
       </w:numPr>
       <w:contextualSpacing/>
     </w:pPr>
+    <w:rPr>
+      <w:rFonts w:ascii="Arial" w:hAnsi="Arial" w:eastAsia="Yu Gothic"/>
+    </w:rPr>
   </w:style>
   <w:style w:type="paragraph" w:styleId="ListBullet3">
     <w:name w:val="List Bullet 3"/>
@@ -4078,6 +4862,9 @@
       </w:numPr>
       <w:contextualSpacing/>
     </w:pPr>
+    <w:rPr>
+      <w:rFonts w:ascii="Arial" w:hAnsi="Arial" w:eastAsia="Yu Gothic"/>
+    </w:rPr>
   </w:style>
   <w:style w:type="paragraph" w:styleId="ListNumber">
     <w:name w:val="List Number"/>
@@ -4091,6 +4878,9 @@
       </w:numPr>
       <w:contextualSpacing/>
     </w:pPr>
+    <w:rPr>
+      <w:rFonts w:ascii="Arial" w:hAnsi="Arial" w:eastAsia="Yu Gothic"/>
+    </w:rPr>
   </w:style>
   <w:style w:type="paragraph" w:styleId="ListNumber2">
     <w:name w:val="List Number 2"/>
@@ -4104,6 +4894,9 @@
       </w:numPr>
       <w:contextualSpacing/>
     </w:pPr>
+    <w:rPr>
+      <w:rFonts w:ascii="Arial" w:hAnsi="Arial" w:eastAsia="Yu Gothic"/>
+    </w:rPr>
   </w:style>
   <w:style w:type="paragraph" w:styleId="ListNumber3">
     <w:name w:val="List Number 3"/>
@@ -4117,6 +4910,9 @@
       </w:numPr>
       <w:contextualSpacing/>
     </w:pPr>
+    <w:rPr>
+      <w:rFonts w:ascii="Arial" w:hAnsi="Arial" w:eastAsia="Yu Gothic"/>
+    </w:rPr>
   </w:style>
   <w:style w:type="paragraph" w:styleId="ListContinue">
     <w:name w:val="List Continue"/>
@@ -4129,6 +4925,9 @@
       <w:ind w:left="360"/>
       <w:contextualSpacing/>
     </w:pPr>
+    <w:rPr>
+      <w:rFonts w:ascii="Arial" w:hAnsi="Arial" w:eastAsia="Yu Gothic"/>
+    </w:rPr>
   </w:style>
   <w:style w:type="paragraph" w:styleId="ListContinue2">
     <w:name w:val="List Continue 2"/>
@@ -4141,6 +4940,9 @@
       <w:ind w:left="720"/>
       <w:contextualSpacing/>
     </w:pPr>
+    <w:rPr>
+      <w:rFonts w:ascii="Arial" w:hAnsi="Arial" w:eastAsia="Yu Gothic"/>
+    </w:rPr>
   </w:style>
   <w:style w:type="paragraph" w:styleId="ListContinue3">
     <w:name w:val="List Continue 3"/>
@@ -4153,6 +4955,9 @@
       <w:ind w:left="1080"/>
       <w:contextualSpacing/>
     </w:pPr>
+    <w:rPr>
+      <w:rFonts w:ascii="Arial" w:hAnsi="Arial" w:eastAsia="Yu Gothic"/>
+    </w:rPr>
   </w:style>
   <w:style w:type="paragraph" w:styleId="MacroText">
     <w:name w:val="macro"/>
@@ -4172,7 +4977,7 @@
       </w:tabs>
     </w:pPr>
     <w:rPr>
-      <w:rFonts w:ascii="Courier" w:hAnsi="Courier"/>
+      <w:rFonts w:ascii="Arial" w:hAnsi="Arial" w:eastAsia="Yu Gothic"/>
       <w:sz w:val="20"/>
       <w:szCs w:val="20"/>
     </w:rPr>
@@ -4198,6 +5003,7 @@
     <w:qFormat/>
     <w:rsid w:val="00FC693F"/>
     <w:rPr>
+      <w:rFonts w:ascii="Arial" w:hAnsi="Arial" w:eastAsia="Yu Gothic"/>
       <w:i/>
       <w:iCs/>
       <w:color w:val="000000" w:themeColor="text1"/>
@@ -4314,6 +5120,7 @@
       <w:spacing w:line="240" w:lineRule="auto"/>
     </w:pPr>
     <w:rPr>
+      <w:rFonts w:ascii="Arial" w:hAnsi="Arial" w:eastAsia="Yu Gothic"/>
       <w:b/>
       <w:bCs/>
       <w:color w:val="4F81BD" w:themeColor="accent1"/>
@@ -4359,6 +5166,7 @@
       <w:ind w:left="936" w:right="936"/>
     </w:pPr>
     <w:rPr>
+      <w:rFonts w:ascii="Arial" w:hAnsi="Arial" w:eastAsia="Yu Gothic"/>
       <w:b/>
       <w:bCs/>
       <w:i/>
@@ -4458,6 +5266,9 @@
     <w:pPr>
       <w:outlineLvl w:val="9"/>
     </w:pPr>
+    <w:rPr>
+      <w:rFonts w:ascii="Arial" w:hAnsi="Arial" w:eastAsia="Yu Gothic"/>
+    </w:rPr>
   </w:style>
   <w:style w:type="table" w:styleId="TableGrid">
     <w:name w:val="Table Grid"/>

</xml_diff>